<commit_message>
feat: 7-oktyabr yangi so'rovnoma javoblarini kiritish va topshirmaganlar hisobotini yangilash
</commit_message>
<xml_diff>
--- a/hisobotlar/1-kurs_Sorovnoma_Topshirmaganlar_Hisoboti.docx
+++ b/hisobotlar/1-kurs_Sorovnoma_Topshirmaganlar_Hisoboti.docx
@@ -329,7 +329,7 @@
                 <w:b/>
                 <w:sz w:val="19"/>
               </w:rPr>
-              <w:t>15</w:t>
+              <w:t>14</w:t>
             </w:r>
           </w:p>
         </w:tc>
@@ -361,7 +361,7 @@
         <w:tc>
           <w:tcPr>
             <w:tcW w:type="dxa" w:w="1543"/>
-            <w:shd w:fill="FEF3C7"/>
+            <w:shd w:fill="FFFFFF"/>
             <w:tcMar>
               <w:top w:w="80" w:type="dxa"/>
               <w:bottom w:w="80" w:type="dxa"/>
@@ -379,7 +379,7 @@
                 <w:b/>
                 <w:sz w:val="19"/>
               </w:rPr>
-              <w:t>1</w:t>
+              <w:t>0</w:t>
             </w:r>
           </w:p>
         </w:tc>
@@ -404,7 +404,7 @@
                 <w:b w:val="0"/>
                 <w:sz w:val="19"/>
               </w:rPr>
-              <w:t>93.3%</w:t>
+              <w:t>100.0%</w:t>
             </w:r>
           </w:p>
         </w:tc>
@@ -531,7 +531,7 @@
                 <w:b w:val="0"/>
                 <w:sz w:val="19"/>
               </w:rPr>
-              <w:t>30</w:t>
+              <w:t>31</w:t>
             </w:r>
           </w:p>
         </w:tc>
@@ -556,7 +556,7 @@
                 <w:b/>
                 <w:sz w:val="19"/>
               </w:rPr>
-              <w:t>4</w:t>
+              <w:t>3</w:t>
             </w:r>
           </w:p>
         </w:tc>
@@ -581,7 +581,7 @@
                 <w:b w:val="0"/>
                 <w:sz w:val="19"/>
               </w:rPr>
-              <w:t>88.2%</w:t>
+              <w:t>91.2%</w:t>
             </w:r>
           </w:p>
         </w:tc>
@@ -708,7 +708,7 @@
                 <w:b w:val="0"/>
                 <w:sz w:val="19"/>
               </w:rPr>
-              <w:t>23</w:t>
+              <w:t>24</w:t>
             </w:r>
           </w:p>
         </w:tc>
@@ -733,7 +733,7 @@
                 <w:b/>
                 <w:sz w:val="19"/>
               </w:rPr>
-              <w:t>11</w:t>
+              <w:t>10</w:t>
             </w:r>
           </w:p>
         </w:tc>
@@ -758,7 +758,7 @@
                 <w:b w:val="0"/>
                 <w:sz w:val="19"/>
               </w:rPr>
-              <w:t>67.6%</w:t>
+              <w:t>70.6%</w:t>
             </w:r>
           </w:p>
         </w:tc>
@@ -885,7 +885,7 @@
                 <w:b w:val="0"/>
                 <w:sz w:val="19"/>
               </w:rPr>
-              <w:t>29</w:t>
+              <w:t>30</w:t>
             </w:r>
           </w:p>
         </w:tc>
@@ -910,7 +910,7 @@
                 <w:b/>
                 <w:sz w:val="19"/>
               </w:rPr>
-              <w:t>3</w:t>
+              <w:t>2</w:t>
             </w:r>
           </w:p>
         </w:tc>
@@ -935,7 +935,7 @@
                 <w:b w:val="0"/>
                 <w:sz w:val="19"/>
               </w:rPr>
-              <w:t>90.6%</w:t>
+              <w:t>93.8%</w:t>
             </w:r>
           </w:p>
         </w:tc>
@@ -1062,7 +1062,7 @@
                 <w:b w:val="0"/>
                 <w:sz w:val="19"/>
               </w:rPr>
-              <w:t>28</w:t>
+              <w:t>29</w:t>
             </w:r>
           </w:p>
         </w:tc>
@@ -1087,7 +1087,7 @@
                 <w:b/>
                 <w:sz w:val="19"/>
               </w:rPr>
-              <w:t>4</w:t>
+              <w:t>3</w:t>
             </w:r>
           </w:p>
         </w:tc>
@@ -1112,7 +1112,7 @@
                 <w:b w:val="0"/>
                 <w:sz w:val="19"/>
               </w:rPr>
-              <w:t>87.5%</w:t>
+              <w:t>90.6%</w:t>
             </w:r>
           </w:p>
         </w:tc>
@@ -1214,7 +1214,7 @@
                 <w:b/>
                 <w:sz w:val="19"/>
               </w:rPr>
-              <w:t>35</w:t>
+              <w:t>34</w:t>
             </w:r>
           </w:p>
         </w:tc>
@@ -1239,7 +1239,7 @@
                 <w:b w:val="0"/>
                 <w:sz w:val="19"/>
               </w:rPr>
-              <w:t>30</w:t>
+              <w:t>29</w:t>
             </w:r>
           </w:p>
         </w:tc>
@@ -1289,7 +1289,7 @@
                 <w:b w:val="0"/>
                 <w:sz w:val="19"/>
               </w:rPr>
-              <w:t>85.7%</w:t>
+              <w:t>85.3%</w:t>
             </w:r>
           </w:p>
         </w:tc>
@@ -1391,7 +1391,7 @@
                 <w:b/>
                 <w:sz w:val="19"/>
               </w:rPr>
-              <w:t>1</w:t>
+              <w:t>0</w:t>
             </w:r>
           </w:p>
         </w:tc>
@@ -1423,7 +1423,7 @@
         <w:tc>
           <w:tcPr>
             <w:tcW w:type="dxa" w:w="1543"/>
-            <w:shd w:fill="FEF3C7"/>
+            <w:shd w:fill="FFFFFF"/>
             <w:tcMar>
               <w:top w:w="80" w:type="dxa"/>
               <w:bottom w:w="80" w:type="dxa"/>
@@ -1441,7 +1441,7 @@
                 <w:b/>
                 <w:sz w:val="19"/>
               </w:rPr>
-              <w:t>1</w:t>
+              <w:t>0</w:t>
             </w:r>
           </w:p>
         </w:tc>
@@ -1566,7 +1566,7 @@
                 <w:b/>
                 <w:sz w:val="20"/>
               </w:rPr>
-              <w:t>183</w:t>
+              <w:t>180</w:t>
             </w:r>
           </w:p>
         </w:tc>
@@ -1591,7 +1591,7 @@
                 <w:b/>
                 <w:sz w:val="20"/>
               </w:rPr>
-              <w:t>154</w:t>
+              <w:t>157</w:t>
             </w:r>
           </w:p>
         </w:tc>
@@ -1616,7 +1616,7 @@
                 <w:b/>
                 <w:sz w:val="20"/>
               </w:rPr>
-              <w:t>29</w:t>
+              <w:t>23</w:t>
             </w:r>
           </w:p>
         </w:tc>
@@ -1641,7 +1641,7 @@
                 <w:b/>
                 <w:sz w:val="20"/>
               </w:rPr>
-              <w:t>84.2%</w:t>
+              <w:t>87.2%</w:t>
             </w:r>
           </w:p>
         </w:tc>
@@ -1663,354 +1663,7 @@
           <w:color w:val="312E81"/>
           <w:sz w:val="24"/>
         </w:rPr>
-        <w:t>📌 26-01 GURUHI — SO'ROVNOMA TOPSHIRMAGAN TALABALAR (1 NAFAR)</w:t>
-      </w:r>
-      <w:r>
-        <w:rPr>
-          <w:rFonts w:ascii="Times New Roman" w:hAnsi="Times New Roman"/>
-          <w:i/>
-          <w:sz w:val="22"/>
-        </w:rPr>
-        <w:t xml:space="preserve">  |  Guruh rahbari: Mirzayeva.D</w:t>
-      </w:r>
-    </w:p>
-    <w:tbl>
-      <w:tblPr>
-        <w:tblW w:type="auto" w:w="0"/>
-        <w:jc w:val="center"/>
-        <w:tblLook w:firstColumn="1" w:firstRow="1" w:lastColumn="0" w:lastRow="0" w:noHBand="0" w:noVBand="1" w:val="04A0"/>
-      </w:tblPr>
-      <w:tblGrid>
-        <w:gridCol w:w="1800"/>
-        <w:gridCol w:w="1800"/>
-        <w:gridCol w:w="1800"/>
-        <w:gridCol w:w="1800"/>
-        <w:gridCol w:w="1800"/>
-        <w:gridCol w:w="1800"/>
-      </w:tblGrid>
-      <w:tr>
-        <w:tc>
-          <w:tcPr>
-            <w:tcW w:type="dxa" w:w="1800"/>
-            <w:shd w:fill="312E81"/>
-            <w:tcMar>
-              <w:top w:w="100" w:type="dxa"/>
-              <w:bottom w:w="100" w:type="dxa"/>
-              <w:left w:w="80" w:type="dxa"/>
-              <w:right w:w="80" w:type="dxa"/>
-            </w:tcMar>
-          </w:tcPr>
-          <w:p>
-            <w:pPr>
-              <w:jc w:val="center"/>
-            </w:pPr>
-            <w:r>
-              <w:rPr>
-                <w:rFonts w:ascii="Times New Roman" w:hAnsi="Times New Roman"/>
-                <w:b/>
-                <w:color w:val="FFFFFF"/>
-                <w:sz w:val="19"/>
-              </w:rPr>
-              <w:t>№</w:t>
-            </w:r>
-          </w:p>
-        </w:tc>
-        <w:tc>
-          <w:tcPr>
-            <w:tcW w:type="dxa" w:w="1800"/>
-            <w:shd w:fill="312E81"/>
-            <w:tcMar>
-              <w:top w:w="100" w:type="dxa"/>
-              <w:bottom w:w="100" w:type="dxa"/>
-              <w:left w:w="80" w:type="dxa"/>
-              <w:right w:w="80" w:type="dxa"/>
-            </w:tcMar>
-          </w:tcPr>
-          <w:p>
-            <w:pPr>
-              <w:jc w:val="center"/>
-            </w:pPr>
-            <w:r>
-              <w:rPr>
-                <w:rFonts w:ascii="Times New Roman" w:hAnsi="Times New Roman"/>
-                <w:b/>
-                <w:color w:val="FFFFFF"/>
-                <w:sz w:val="19"/>
-              </w:rPr>
-              <w:t>Talaba Familiyasi, Ismi, Otasining ismi</w:t>
-            </w:r>
-          </w:p>
-        </w:tc>
-        <w:tc>
-          <w:tcPr>
-            <w:tcW w:type="dxa" w:w="1800"/>
-            <w:shd w:fill="312E81"/>
-            <w:tcMar>
-              <w:top w:w="100" w:type="dxa"/>
-              <w:bottom w:w="100" w:type="dxa"/>
-              <w:left w:w="80" w:type="dxa"/>
-              <w:right w:w="80" w:type="dxa"/>
-            </w:tcMar>
-          </w:tcPr>
-          <w:p>
-            <w:pPr>
-              <w:jc w:val="center"/>
-            </w:pPr>
-            <w:r>
-              <w:rPr>
-                <w:rFonts w:ascii="Times New Roman" w:hAnsi="Times New Roman"/>
-                <w:b/>
-                <w:color w:val="FFFFFF"/>
-                <w:sz w:val="19"/>
-              </w:rPr>
-              <w:t>Pasport №</w:t>
-            </w:r>
-          </w:p>
-        </w:tc>
-        <w:tc>
-          <w:tcPr>
-            <w:tcW w:type="dxa" w:w="1800"/>
-            <w:shd w:fill="312E81"/>
-            <w:tcMar>
-              <w:top w:w="100" w:type="dxa"/>
-              <w:bottom w:w="100" w:type="dxa"/>
-              <w:left w:w="80" w:type="dxa"/>
-              <w:right w:w="80" w:type="dxa"/>
-            </w:tcMar>
-          </w:tcPr>
-          <w:p>
-            <w:pPr>
-              <w:jc w:val="center"/>
-            </w:pPr>
-            <w:r>
-              <w:rPr>
-                <w:rFonts w:ascii="Times New Roman" w:hAnsi="Times New Roman"/>
-                <w:b/>
-                <w:color w:val="FFFFFF"/>
-                <w:sz w:val="19"/>
-              </w:rPr>
-              <w:t>Telefon raqami</w:t>
-            </w:r>
-          </w:p>
-        </w:tc>
-        <w:tc>
-          <w:tcPr>
-            <w:tcW w:type="dxa" w:w="1800"/>
-            <w:shd w:fill="312E81"/>
-            <w:tcMar>
-              <w:top w:w="100" w:type="dxa"/>
-              <w:bottom w:w="100" w:type="dxa"/>
-              <w:left w:w="80" w:type="dxa"/>
-              <w:right w:w="80" w:type="dxa"/>
-            </w:tcMar>
-          </w:tcPr>
-          <w:p>
-            <w:pPr>
-              <w:jc w:val="center"/>
-            </w:pPr>
-            <w:r>
-              <w:rPr>
-                <w:rFonts w:ascii="Times New Roman" w:hAnsi="Times New Roman"/>
-                <w:b/>
-                <w:color w:val="FFFFFF"/>
-                <w:sz w:val="19"/>
-              </w:rPr>
-              <w:t>Holati</w:t>
-            </w:r>
-          </w:p>
-        </w:tc>
-        <w:tc>
-          <w:tcPr>
-            <w:tcW w:type="dxa" w:w="1800"/>
-            <w:shd w:fill="312E81"/>
-            <w:tcMar>
-              <w:top w:w="100" w:type="dxa"/>
-              <w:bottom w:w="100" w:type="dxa"/>
-              <w:left w:w="80" w:type="dxa"/>
-              <w:right w:w="80" w:type="dxa"/>
-            </w:tcMar>
-          </w:tcPr>
-          <w:p>
-            <w:pPr>
-              <w:jc w:val="center"/>
-            </w:pPr>
-            <w:r>
-              <w:rPr>
-                <w:rFonts w:ascii="Times New Roman" w:hAnsi="Times New Roman"/>
-                <w:b/>
-                <w:color w:val="FFFFFF"/>
-                <w:sz w:val="19"/>
-              </w:rPr>
-              <w:t>Guruh rahbari qaydi / Yangi manzil</w:t>
-            </w:r>
-          </w:p>
-        </w:tc>
-      </w:tr>
-      <w:tr>
-        <w:tc>
-          <w:tcPr>
-            <w:tcW w:type="dxa" w:w="1800"/>
-            <w:shd w:fill="FEE2E2"/>
-            <w:tcMar>
-              <w:top w:w="80" w:type="dxa"/>
-              <w:bottom w:w="80" w:type="dxa"/>
-              <w:left w:w="80" w:type="dxa"/>
-              <w:right w:w="80" w:type="dxa"/>
-            </w:tcMar>
-          </w:tcPr>
-          <w:p>
-            <w:pPr>
-              <w:jc w:val="center"/>
-            </w:pPr>
-            <w:r>
-              <w:rPr>
-                <w:rFonts w:ascii="Times New Roman" w:hAnsi="Times New Roman"/>
-                <w:b w:val="0"/>
-                <w:sz w:val="19"/>
-              </w:rPr>
-              <w:t>1</w:t>
-            </w:r>
-          </w:p>
-        </w:tc>
-        <w:tc>
-          <w:tcPr>
-            <w:tcW w:type="dxa" w:w="1800"/>
-            <w:shd w:fill="FEE2E2"/>
-            <w:tcMar>
-              <w:top w:w="80" w:type="dxa"/>
-              <w:bottom w:w="80" w:type="dxa"/>
-              <w:left w:w="80" w:type="dxa"/>
-              <w:right w:w="80" w:type="dxa"/>
-            </w:tcMar>
-          </w:tcPr>
-          <w:p>
-            <w:pPr>
-              <w:jc w:val="left"/>
-            </w:pPr>
-            <w:r>
-              <w:rPr>
-                <w:rFonts w:ascii="Times New Roman" w:hAnsi="Times New Roman"/>
-                <w:b/>
-                <w:sz w:val="19"/>
-              </w:rPr>
-              <w:t>Shermatova Gulsun Xurshid qizi</w:t>
-            </w:r>
-          </w:p>
-        </w:tc>
-        <w:tc>
-          <w:tcPr>
-            <w:tcW w:type="dxa" w:w="1800"/>
-            <w:shd w:fill="FEE2E2"/>
-            <w:tcMar>
-              <w:top w:w="80" w:type="dxa"/>
-              <w:bottom w:w="80" w:type="dxa"/>
-              <w:left w:w="80" w:type="dxa"/>
-              <w:right w:w="80" w:type="dxa"/>
-            </w:tcMar>
-          </w:tcPr>
-          <w:p>
-            <w:pPr>
-              <w:jc w:val="center"/>
-            </w:pPr>
-            <w:r>
-              <w:rPr>
-                <w:rFonts w:ascii="Times New Roman" w:hAnsi="Times New Roman"/>
-                <w:b w:val="0"/>
-                <w:sz w:val="19"/>
-              </w:rPr>
-              <w:t>AE5836574</w:t>
-            </w:r>
-          </w:p>
-        </w:tc>
-        <w:tc>
-          <w:tcPr>
-            <w:tcW w:type="dxa" w:w="1800"/>
-            <w:shd w:fill="FEE2E2"/>
-            <w:tcMar>
-              <w:top w:w="80" w:type="dxa"/>
-              <w:bottom w:w="80" w:type="dxa"/>
-              <w:left w:w="80" w:type="dxa"/>
-              <w:right w:w="80" w:type="dxa"/>
-            </w:tcMar>
-          </w:tcPr>
-          <w:p>
-            <w:pPr>
-              <w:jc w:val="center"/>
-            </w:pPr>
-            <w:r>
-              <w:rPr>
-                <w:rFonts w:ascii="Times New Roman" w:hAnsi="Times New Roman"/>
-                <w:b w:val="0"/>
-                <w:sz w:val="19"/>
-              </w:rPr>
-              <w:t>Mavjud emas</w:t>
-            </w:r>
-          </w:p>
-        </w:tc>
-        <w:tc>
-          <w:tcPr>
-            <w:tcW w:type="dxa" w:w="1800"/>
-            <w:shd w:fill="FEE2E2"/>
-            <w:tcMar>
-              <w:top w:w="80" w:type="dxa"/>
-              <w:bottom w:w="80" w:type="dxa"/>
-              <w:left w:w="80" w:type="dxa"/>
-              <w:right w:w="80" w:type="dxa"/>
-            </w:tcMar>
-          </w:tcPr>
-          <w:p>
-            <w:pPr>
-              <w:jc w:val="center"/>
-            </w:pPr>
-            <w:r>
-              <w:rPr>
-                <w:rFonts w:ascii="Times New Roman" w:hAnsi="Times New Roman"/>
-                <w:b/>
-                <w:color w:val="991B1B"/>
-                <w:sz w:val="19"/>
-              </w:rPr>
-              <w:t>🔴 Telefoni yo'q</w:t>
-            </w:r>
-          </w:p>
-        </w:tc>
-        <w:tc>
-          <w:tcPr>
-            <w:tcW w:type="dxa" w:w="1800"/>
-            <w:shd w:fill="FFFFFF"/>
-            <w:tcMar>
-              <w:top w:w="80" w:type="dxa"/>
-              <w:bottom w:w="80" w:type="dxa"/>
-              <w:left w:w="80" w:type="dxa"/>
-              <w:right w:w="80" w:type="dxa"/>
-            </w:tcMar>
-          </w:tcPr>
-          <w:p>
-            <w:pPr>
-              <w:jc w:val="left"/>
-            </w:pPr>
-            <w:r>
-              <w:rPr>
-                <w:rFonts w:ascii="Times New Roman" w:hAnsi="Times New Roman"/>
-                <w:b w:val="0"/>
-                <w:sz w:val="19"/>
-              </w:rPr>
-            </w:r>
-          </w:p>
-        </w:tc>
-      </w:tr>
-    </w:tbl>
-    <w:p>
-      <w:pPr>
-        <w:spacing w:before="280" w:after="120"/>
-      </w:pPr>
-      <w:r>
-        <w:rPr>
-          <w:rFonts w:ascii="Times New Roman" w:hAnsi="Times New Roman"/>
-          <w:b/>
-          <w:color w:val="312E81"/>
-          <w:sz w:val="24"/>
-        </w:rPr>
-        <w:t>📌 26-02 GURUHI — SO'ROVNOMA TOPSHIRMAGAN TALABALAR (4 NAFAR)</w:t>
+        <w:t>📌 26-02 GURUHI — SO'ROVNOMA TOPSHIRMAGAN TALABALAR (3 NAFAR)</w:t>
       </w:r>
       <w:r>
         <w:rPr>
@@ -2647,158 +2300,6 @@
           </w:p>
         </w:tc>
       </w:tr>
-      <w:tr>
-        <w:tc>
-          <w:tcPr>
-            <w:tcW w:type="dxa" w:w="1800"/>
-            <w:shd w:fill="FEE2E2"/>
-            <w:tcMar>
-              <w:top w:w="80" w:type="dxa"/>
-              <w:bottom w:w="80" w:type="dxa"/>
-              <w:left w:w="80" w:type="dxa"/>
-              <w:right w:w="80" w:type="dxa"/>
-            </w:tcMar>
-          </w:tcPr>
-          <w:p>
-            <w:pPr>
-              <w:jc w:val="center"/>
-            </w:pPr>
-            <w:r>
-              <w:rPr>
-                <w:rFonts w:ascii="Times New Roman" w:hAnsi="Times New Roman"/>
-                <w:b w:val="0"/>
-                <w:sz w:val="19"/>
-              </w:rPr>
-              <w:t>4</w:t>
-            </w:r>
-          </w:p>
-        </w:tc>
-        <w:tc>
-          <w:tcPr>
-            <w:tcW w:type="dxa" w:w="1800"/>
-            <w:shd w:fill="FEE2E2"/>
-            <w:tcMar>
-              <w:top w:w="80" w:type="dxa"/>
-              <w:bottom w:w="80" w:type="dxa"/>
-              <w:left w:w="80" w:type="dxa"/>
-              <w:right w:w="80" w:type="dxa"/>
-            </w:tcMar>
-          </w:tcPr>
-          <w:p>
-            <w:pPr>
-              <w:jc w:val="left"/>
-            </w:pPr>
-            <w:r>
-              <w:rPr>
-                <w:rFonts w:ascii="Times New Roman" w:hAnsi="Times New Roman"/>
-                <w:b/>
-                <w:sz w:val="19"/>
-              </w:rPr>
-              <w:t>Shonazarova Vazira Botir qizi</w:t>
-            </w:r>
-          </w:p>
-        </w:tc>
-        <w:tc>
-          <w:tcPr>
-            <w:tcW w:type="dxa" w:w="1800"/>
-            <w:shd w:fill="FEE2E2"/>
-            <w:tcMar>
-              <w:top w:w="80" w:type="dxa"/>
-              <w:bottom w:w="80" w:type="dxa"/>
-              <w:left w:w="80" w:type="dxa"/>
-              <w:right w:w="80" w:type="dxa"/>
-            </w:tcMar>
-          </w:tcPr>
-          <w:p>
-            <w:pPr>
-              <w:jc w:val="center"/>
-            </w:pPr>
-            <w:r>
-              <w:rPr>
-                <w:rFonts w:ascii="Times New Roman" w:hAnsi="Times New Roman"/>
-                <w:b w:val="0"/>
-                <w:sz w:val="19"/>
-              </w:rPr>
-              <w:t>AE 4233482</w:t>
-            </w:r>
-          </w:p>
-        </w:tc>
-        <w:tc>
-          <w:tcPr>
-            <w:tcW w:type="dxa" w:w="1800"/>
-            <w:shd w:fill="FEE2E2"/>
-            <w:tcMar>
-              <w:top w:w="80" w:type="dxa"/>
-              <w:bottom w:w="80" w:type="dxa"/>
-              <w:left w:w="80" w:type="dxa"/>
-              <w:right w:w="80" w:type="dxa"/>
-            </w:tcMar>
-          </w:tcPr>
-          <w:p>
-            <w:pPr>
-              <w:jc w:val="center"/>
-            </w:pPr>
-            <w:r>
-              <w:rPr>
-                <w:rFonts w:ascii="Times New Roman" w:hAnsi="Times New Roman"/>
-                <w:b w:val="0"/>
-                <w:sz w:val="19"/>
-              </w:rPr>
-              <w:t>Mavjud emas</w:t>
-            </w:r>
-          </w:p>
-        </w:tc>
-        <w:tc>
-          <w:tcPr>
-            <w:tcW w:type="dxa" w:w="1800"/>
-            <w:shd w:fill="FEE2E2"/>
-            <w:tcMar>
-              <w:top w:w="80" w:type="dxa"/>
-              <w:bottom w:w="80" w:type="dxa"/>
-              <w:left w:w="80" w:type="dxa"/>
-              <w:right w:w="80" w:type="dxa"/>
-            </w:tcMar>
-          </w:tcPr>
-          <w:p>
-            <w:pPr>
-              <w:jc w:val="center"/>
-            </w:pPr>
-            <w:r>
-              <w:rPr>
-                <w:rFonts w:ascii="Times New Roman" w:hAnsi="Times New Roman"/>
-                <w:b/>
-                <w:color w:val="991B1B"/>
-                <w:sz w:val="19"/>
-              </w:rPr>
-              <w:t>🔴 Telefoni yo'q</w:t>
-            </w:r>
-          </w:p>
-        </w:tc>
-        <w:tc>
-          <w:tcPr>
-            <w:tcW w:type="dxa" w:w="1800"/>
-            <w:shd w:fill="FFFFFF"/>
-            <w:tcMar>
-              <w:top w:w="80" w:type="dxa"/>
-              <w:bottom w:w="80" w:type="dxa"/>
-              <w:left w:w="80" w:type="dxa"/>
-              <w:right w:w="80" w:type="dxa"/>
-            </w:tcMar>
-          </w:tcPr>
-          <w:p>
-            <w:pPr>
-              <w:jc w:val="left"/>
-            </w:pPr>
-            <w:r>
-              <w:rPr>
-                <w:rFonts w:ascii="Times New Roman" w:hAnsi="Times New Roman"/>
-                <w:b w:val="0"/>
-                <w:sz w:val="19"/>
-              </w:rPr>
-            </w:r>
-          </w:p>
-        </w:tc>
-      </w:tr>
     </w:tbl>
     <w:p>
       <w:pPr>
@@ -2811,7 +2312,7 @@
           <w:color w:val="312E81"/>
           <w:sz w:val="24"/>
         </w:rPr>
-        <w:t>📌 26-03 GURUHI — SO'ROVNOMA TOPSHIRMAGAN TALABALAR (11 NAFAR)</w:t>
+        <w:t>📌 26-03 GURUHI — SO'ROVNOMA TOPSHIRMAGAN TALABALAR (10 NAFAR)</w:t>
       </w:r>
       <w:r>
         <w:rPr>
@@ -3243,7 +2744,7 @@
                 <w:b w:val="0"/>
                 <w:sz w:val="19"/>
               </w:rPr>
-              <w:t>+998 95 259-06-25</w:t>
+              <w:t>+998 95 259-06-25 / +998 99 152-33-71 (Otasi / Onasi)</w:t>
             </w:r>
           </w:p>
         </w:tc>
@@ -3394,7 +2895,7 @@
                 <w:b w:val="0"/>
                 <w:sz w:val="19"/>
               </w:rPr>
-              <w:t>+998 87 358-87-97</w:t>
+              <w:t>+998 87 358-87-97 / +998 88 632-19-72 (Otasi / Onasi)</w:t>
             </w:r>
           </w:p>
         </w:tc>
@@ -3545,7 +3046,7 @@
                 <w:b w:val="0"/>
                 <w:sz w:val="19"/>
               </w:rPr>
-              <w:t>+998 88 803-91-93</w:t>
+              <w:t>+998 88 803-91-93 / +998 88 726-14-12 (Otasi / Onasi)</w:t>
             </w:r>
           </w:p>
         </w:tc>
@@ -4000,7 +3501,7 @@
                 <w:b w:val="0"/>
                 <w:sz w:val="19"/>
               </w:rPr>
-              <w:t>+998 87 392-00-25</w:t>
+              <w:t>+998 87 392-00-25 / +998 87 392-00-21 (Otasi / Onasi)</w:t>
             </w:r>
           </w:p>
         </w:tc>
@@ -4253,7 +3754,7 @@
                 <w:b/>
                 <w:sz w:val="19"/>
               </w:rPr>
-              <w:t>Sayfiyeva Zarina Axmad qizi</w:t>
+              <w:t>Umirova Sevinch Avlayor qizi</w:t>
             </w:r>
           </w:p>
         </w:tc>
@@ -4278,7 +3779,7 @@
                 <w:b w:val="0"/>
                 <w:sz w:val="19"/>
               </w:rPr>
-              <w:t>AD7984192</w:t>
+              <w:t>AD1671106</w:t>
             </w:r>
           </w:p>
         </w:tc>
@@ -4303,7 +3804,7 @@
                 <w:b w:val="0"/>
                 <w:sz w:val="19"/>
               </w:rPr>
-              <w:t>+998 88 000-14-58</w:t>
+              <w:t>+998 87 561-52-96 / +998 77 232-28-78 (Otasi / Onasi)</w:t>
             </w:r>
           </w:p>
         </w:tc>
@@ -4404,157 +3905,6 @@
                 <w:b/>
                 <w:sz w:val="19"/>
               </w:rPr>
-              <w:t>Umirova Sevinch Avlayor qizi</w:t>
-            </w:r>
-          </w:p>
-        </w:tc>
-        <w:tc>
-          <w:tcPr>
-            <w:tcW w:type="dxa" w:w="1800"/>
-            <w:shd w:fill="FEF3C7"/>
-            <w:tcMar>
-              <w:top w:w="80" w:type="dxa"/>
-              <w:bottom w:w="80" w:type="dxa"/>
-              <w:left w:w="80" w:type="dxa"/>
-              <w:right w:w="80" w:type="dxa"/>
-            </w:tcMar>
-          </w:tcPr>
-          <w:p>
-            <w:pPr>
-              <w:jc w:val="center"/>
-            </w:pPr>
-            <w:r>
-              <w:rPr>
-                <w:rFonts w:ascii="Times New Roman" w:hAnsi="Times New Roman"/>
-                <w:b w:val="0"/>
-                <w:sz w:val="19"/>
-              </w:rPr>
-              <w:t>AD1671106</w:t>
-            </w:r>
-          </w:p>
-        </w:tc>
-        <w:tc>
-          <w:tcPr>
-            <w:tcW w:type="dxa" w:w="1800"/>
-            <w:shd w:fill="FEF3C7"/>
-            <w:tcMar>
-              <w:top w:w="80" w:type="dxa"/>
-              <w:bottom w:w="80" w:type="dxa"/>
-              <w:left w:w="80" w:type="dxa"/>
-              <w:right w:w="80" w:type="dxa"/>
-            </w:tcMar>
-          </w:tcPr>
-          <w:p>
-            <w:pPr>
-              <w:jc w:val="center"/>
-            </w:pPr>
-            <w:r>
-              <w:rPr>
-                <w:rFonts w:ascii="Times New Roman" w:hAnsi="Times New Roman"/>
-                <w:b w:val="0"/>
-                <w:sz w:val="19"/>
-              </w:rPr>
-              <w:t>+998 87 561-52-96</w:t>
-            </w:r>
-          </w:p>
-        </w:tc>
-        <w:tc>
-          <w:tcPr>
-            <w:tcW w:type="dxa" w:w="1800"/>
-            <w:shd w:fill="FEF3C7"/>
-            <w:tcMar>
-              <w:top w:w="80" w:type="dxa"/>
-              <w:bottom w:w="80" w:type="dxa"/>
-              <w:left w:w="80" w:type="dxa"/>
-              <w:right w:w="80" w:type="dxa"/>
-            </w:tcMar>
-          </w:tcPr>
-          <w:p>
-            <w:pPr>
-              <w:jc w:val="center"/>
-            </w:pPr>
-            <w:r>
-              <w:rPr>
-                <w:rFonts w:ascii="Times New Roman" w:hAnsi="Times New Roman"/>
-                <w:b/>
-                <w:sz w:val="19"/>
-              </w:rPr>
-              <w:t>🟡 Telefoni bor</w:t>
-            </w:r>
-          </w:p>
-        </w:tc>
-        <w:tc>
-          <w:tcPr>
-            <w:tcW w:type="dxa" w:w="1800"/>
-            <w:shd w:fill="FFFFFF"/>
-            <w:tcMar>
-              <w:top w:w="80" w:type="dxa"/>
-              <w:bottom w:w="80" w:type="dxa"/>
-              <w:left w:w="80" w:type="dxa"/>
-              <w:right w:w="80" w:type="dxa"/>
-            </w:tcMar>
-          </w:tcPr>
-          <w:p>
-            <w:pPr>
-              <w:jc w:val="left"/>
-            </w:pPr>
-            <w:r>
-              <w:rPr>
-                <w:rFonts w:ascii="Times New Roman" w:hAnsi="Times New Roman"/>
-                <w:b w:val="0"/>
-                <w:sz w:val="19"/>
-              </w:rPr>
-            </w:r>
-          </w:p>
-        </w:tc>
-      </w:tr>
-      <w:tr>
-        <w:tc>
-          <w:tcPr>
-            <w:tcW w:type="dxa" w:w="1800"/>
-            <w:shd w:fill="FEF3C7"/>
-            <w:tcMar>
-              <w:top w:w="80" w:type="dxa"/>
-              <w:bottom w:w="80" w:type="dxa"/>
-              <w:left w:w="80" w:type="dxa"/>
-              <w:right w:w="80" w:type="dxa"/>
-            </w:tcMar>
-          </w:tcPr>
-          <w:p>
-            <w:pPr>
-              <w:jc w:val="center"/>
-            </w:pPr>
-            <w:r>
-              <w:rPr>
-                <w:rFonts w:ascii="Times New Roman" w:hAnsi="Times New Roman"/>
-                <w:b w:val="0"/>
-                <w:sz w:val="19"/>
-              </w:rPr>
-              <w:t>11</w:t>
-            </w:r>
-          </w:p>
-        </w:tc>
-        <w:tc>
-          <w:tcPr>
-            <w:tcW w:type="dxa" w:w="1800"/>
-            <w:shd w:fill="FEF3C7"/>
-            <w:tcMar>
-              <w:top w:w="80" w:type="dxa"/>
-              <w:bottom w:w="80" w:type="dxa"/>
-              <w:left w:w="80" w:type="dxa"/>
-              <w:right w:w="80" w:type="dxa"/>
-            </w:tcMar>
-          </w:tcPr>
-          <w:p>
-            <w:pPr>
-              <w:jc w:val="left"/>
-            </w:pPr>
-            <w:r>
-              <w:rPr>
-                <w:rFonts w:ascii="Times New Roman" w:hAnsi="Times New Roman"/>
-                <w:b/>
-                <w:sz w:val="19"/>
-              </w:rPr>
               <w:t>Xurramova Sabina Yuldosh qizi</w:t>
             </w:r>
           </w:p>
@@ -4605,7 +3955,7 @@
                 <w:b w:val="0"/>
                 <w:sz w:val="19"/>
               </w:rPr>
-              <w:t>+998 97 960-25-35</w:t>
+              <w:t>+998 97 960-25-35 / +998 91 216-23-04 (Otasi / Onasi)</w:t>
             </w:r>
           </w:p>
         </w:tc>
@@ -4671,7 +4021,7 @@
           <w:color w:val="312E81"/>
           <w:sz w:val="24"/>
         </w:rPr>
-        <w:t>📌 26-04 GURUHI — SO'ROVNOMA TOPSHIRMAGAN TALABALAR (3 NAFAR)</w:t>
+        <w:t>📌 26-04 GURUHI — SO'ROVNOMA TOPSHIRMAGAN TALABALAR (2 NAFAR)</w:t>
       </w:r>
       <w:r>
         <w:rPr>
@@ -4951,7 +4301,7 @@
                 <w:b w:val="0"/>
                 <w:sz w:val="19"/>
               </w:rPr>
-              <w:t>+998 99 153-48-38</w:t>
+              <w:t>+998 99 153-48-38 / +998 70 034-22-44 (Otasi / Onasi)</w:t>
             </w:r>
           </w:p>
         </w:tc>
@@ -5028,157 +4378,6 @@
                 <w:sz w:val="19"/>
               </w:rPr>
               <w:t>2</w:t>
-            </w:r>
-          </w:p>
-        </w:tc>
-        <w:tc>
-          <w:tcPr>
-            <w:tcW w:type="dxa" w:w="1800"/>
-            <w:shd w:fill="FEF3C7"/>
-            <w:tcMar>
-              <w:top w:w="80" w:type="dxa"/>
-              <w:bottom w:w="80" w:type="dxa"/>
-              <w:left w:w="80" w:type="dxa"/>
-              <w:right w:w="80" w:type="dxa"/>
-            </w:tcMar>
-          </w:tcPr>
-          <w:p>
-            <w:pPr>
-              <w:jc w:val="left"/>
-            </w:pPr>
-            <w:r>
-              <w:rPr>
-                <w:rFonts w:ascii="Times New Roman" w:hAnsi="Times New Roman"/>
-                <w:b/>
-                <w:sz w:val="19"/>
-              </w:rPr>
-              <w:t>Hamroqulova Marjona O'ktam qizi</w:t>
-            </w:r>
-          </w:p>
-        </w:tc>
-        <w:tc>
-          <w:tcPr>
-            <w:tcW w:type="dxa" w:w="1800"/>
-            <w:shd w:fill="FEF3C7"/>
-            <w:tcMar>
-              <w:top w:w="80" w:type="dxa"/>
-              <w:bottom w:w="80" w:type="dxa"/>
-              <w:left w:w="80" w:type="dxa"/>
-              <w:right w:w="80" w:type="dxa"/>
-            </w:tcMar>
-          </w:tcPr>
-          <w:p>
-            <w:pPr>
-              <w:jc w:val="center"/>
-            </w:pPr>
-            <w:r>
-              <w:rPr>
-                <w:rFonts w:ascii="Times New Roman" w:hAnsi="Times New Roman"/>
-                <w:b w:val="0"/>
-                <w:sz w:val="19"/>
-              </w:rPr>
-              <w:t>AE1525748</w:t>
-            </w:r>
-          </w:p>
-        </w:tc>
-        <w:tc>
-          <w:tcPr>
-            <w:tcW w:type="dxa" w:w="1800"/>
-            <w:shd w:fill="FEF3C7"/>
-            <w:tcMar>
-              <w:top w:w="80" w:type="dxa"/>
-              <w:bottom w:w="80" w:type="dxa"/>
-              <w:left w:w="80" w:type="dxa"/>
-              <w:right w:w="80" w:type="dxa"/>
-            </w:tcMar>
-          </w:tcPr>
-          <w:p>
-            <w:pPr>
-              <w:jc w:val="center"/>
-            </w:pPr>
-            <w:r>
-              <w:rPr>
-                <w:rFonts w:ascii="Times New Roman" w:hAnsi="Times New Roman"/>
-                <w:b w:val="0"/>
-                <w:sz w:val="19"/>
-              </w:rPr>
-              <w:t>+998 91 005-49-08</w:t>
-            </w:r>
-          </w:p>
-        </w:tc>
-        <w:tc>
-          <w:tcPr>
-            <w:tcW w:type="dxa" w:w="1800"/>
-            <w:shd w:fill="FEF3C7"/>
-            <w:tcMar>
-              <w:top w:w="80" w:type="dxa"/>
-              <w:bottom w:w="80" w:type="dxa"/>
-              <w:left w:w="80" w:type="dxa"/>
-              <w:right w:w="80" w:type="dxa"/>
-            </w:tcMar>
-          </w:tcPr>
-          <w:p>
-            <w:pPr>
-              <w:jc w:val="center"/>
-            </w:pPr>
-            <w:r>
-              <w:rPr>
-                <w:rFonts w:ascii="Times New Roman" w:hAnsi="Times New Roman"/>
-                <w:b/>
-                <w:sz w:val="19"/>
-              </w:rPr>
-              <w:t>🟡 Telefoni bor</w:t>
-            </w:r>
-          </w:p>
-        </w:tc>
-        <w:tc>
-          <w:tcPr>
-            <w:tcW w:type="dxa" w:w="1800"/>
-            <w:shd w:fill="FFFFFF"/>
-            <w:tcMar>
-              <w:top w:w="80" w:type="dxa"/>
-              <w:bottom w:w="80" w:type="dxa"/>
-              <w:left w:w="80" w:type="dxa"/>
-              <w:right w:w="80" w:type="dxa"/>
-            </w:tcMar>
-          </w:tcPr>
-          <w:p>
-            <w:pPr>
-              <w:jc w:val="left"/>
-            </w:pPr>
-            <w:r>
-              <w:rPr>
-                <w:rFonts w:ascii="Times New Roman" w:hAnsi="Times New Roman"/>
-                <w:b w:val="0"/>
-                <w:sz w:val="19"/>
-              </w:rPr>
-            </w:r>
-          </w:p>
-        </w:tc>
-      </w:tr>
-      <w:tr>
-        <w:tc>
-          <w:tcPr>
-            <w:tcW w:type="dxa" w:w="1800"/>
-            <w:shd w:fill="FEF3C7"/>
-            <w:tcMar>
-              <w:top w:w="80" w:type="dxa"/>
-              <w:bottom w:w="80" w:type="dxa"/>
-              <w:left w:w="80" w:type="dxa"/>
-              <w:right w:w="80" w:type="dxa"/>
-            </w:tcMar>
-          </w:tcPr>
-          <w:p>
-            <w:pPr>
-              <w:jc w:val="center"/>
-            </w:pPr>
-            <w:r>
-              <w:rPr>
-                <w:rFonts w:ascii="Times New Roman" w:hAnsi="Times New Roman"/>
-                <w:b w:val="0"/>
-                <w:sz w:val="19"/>
-              </w:rPr>
-              <w:t>3</w:t>
             </w:r>
           </w:p>
         </w:tc>
@@ -5319,7 +4518,7 @@
           <w:color w:val="312E81"/>
           <w:sz w:val="24"/>
         </w:rPr>
-        <w:t>📌 26-05 GURUHI — SO'ROVNOMA TOPSHIRMAGAN TALABALAR (4 NAFAR)</w:t>
+        <w:t>📌 26-05 GURUHI — SO'ROVNOMA TOPSHIRMAGAN TALABALAR (3 NAFAR)</w:t>
       </w:r>
       <w:r>
         <w:rPr>
@@ -5599,7 +4798,7 @@
                 <w:b w:val="0"/>
                 <w:sz w:val="19"/>
               </w:rPr>
-              <w:t>+998 87 636-07-08</w:t>
+              <w:t>+998 87 636-07-08 / +998 97 636-37-74 (Otasi / Onasi)</w:t>
             </w:r>
           </w:p>
         </w:tc>
@@ -5750,158 +4949,7 @@
                 <w:b w:val="0"/>
                 <w:sz w:val="19"/>
               </w:rPr>
-              <w:t>+998 88 100-95-04</w:t>
-            </w:r>
-          </w:p>
-        </w:tc>
-        <w:tc>
-          <w:tcPr>
-            <w:tcW w:type="dxa" w:w="1800"/>
-            <w:shd w:fill="FEF3C7"/>
-            <w:tcMar>
-              <w:top w:w="80" w:type="dxa"/>
-              <w:bottom w:w="80" w:type="dxa"/>
-              <w:left w:w="80" w:type="dxa"/>
-              <w:right w:w="80" w:type="dxa"/>
-            </w:tcMar>
-          </w:tcPr>
-          <w:p>
-            <w:pPr>
-              <w:jc w:val="center"/>
-            </w:pPr>
-            <w:r>
-              <w:rPr>
-                <w:rFonts w:ascii="Times New Roman" w:hAnsi="Times New Roman"/>
-                <w:b/>
-                <w:sz w:val="19"/>
-              </w:rPr>
-              <w:t>🟡 Telefoni bor</w:t>
-            </w:r>
-          </w:p>
-        </w:tc>
-        <w:tc>
-          <w:tcPr>
-            <w:tcW w:type="dxa" w:w="1800"/>
-            <w:shd w:fill="FFFFFF"/>
-            <w:tcMar>
-              <w:top w:w="80" w:type="dxa"/>
-              <w:bottom w:w="80" w:type="dxa"/>
-              <w:left w:w="80" w:type="dxa"/>
-              <w:right w:w="80" w:type="dxa"/>
-            </w:tcMar>
-          </w:tcPr>
-          <w:p>
-            <w:pPr>
-              <w:jc w:val="left"/>
-            </w:pPr>
-            <w:r>
-              <w:rPr>
-                <w:rFonts w:ascii="Times New Roman" w:hAnsi="Times New Roman"/>
-                <w:b w:val="0"/>
-                <w:sz w:val="19"/>
-              </w:rPr>
-            </w:r>
-          </w:p>
-        </w:tc>
-      </w:tr>
-      <w:tr>
-        <w:tc>
-          <w:tcPr>
-            <w:tcW w:type="dxa" w:w="1800"/>
-            <w:shd w:fill="FEF3C7"/>
-            <w:tcMar>
-              <w:top w:w="80" w:type="dxa"/>
-              <w:bottom w:w="80" w:type="dxa"/>
-              <w:left w:w="80" w:type="dxa"/>
-              <w:right w:w="80" w:type="dxa"/>
-            </w:tcMar>
-          </w:tcPr>
-          <w:p>
-            <w:pPr>
-              <w:jc w:val="center"/>
-            </w:pPr>
-            <w:r>
-              <w:rPr>
-                <w:rFonts w:ascii="Times New Roman" w:hAnsi="Times New Roman"/>
-                <w:b w:val="0"/>
-                <w:sz w:val="19"/>
-              </w:rPr>
-              <w:t>3</w:t>
-            </w:r>
-          </w:p>
-        </w:tc>
-        <w:tc>
-          <w:tcPr>
-            <w:tcW w:type="dxa" w:w="1800"/>
-            <w:shd w:fill="FEF3C7"/>
-            <w:tcMar>
-              <w:top w:w="80" w:type="dxa"/>
-              <w:bottom w:w="80" w:type="dxa"/>
-              <w:left w:w="80" w:type="dxa"/>
-              <w:right w:w="80" w:type="dxa"/>
-            </w:tcMar>
-          </w:tcPr>
-          <w:p>
-            <w:pPr>
-              <w:jc w:val="left"/>
-            </w:pPr>
-            <w:r>
-              <w:rPr>
-                <w:rFonts w:ascii="Times New Roman" w:hAnsi="Times New Roman"/>
-                <w:b/>
-                <w:sz w:val="19"/>
-              </w:rPr>
-              <w:t>Jalilova Jasmina Jamshid qizi</w:t>
-            </w:r>
-          </w:p>
-        </w:tc>
-        <w:tc>
-          <w:tcPr>
-            <w:tcW w:type="dxa" w:w="1800"/>
-            <w:shd w:fill="FEF3C7"/>
-            <w:tcMar>
-              <w:top w:w="80" w:type="dxa"/>
-              <w:bottom w:w="80" w:type="dxa"/>
-              <w:left w:w="80" w:type="dxa"/>
-              <w:right w:w="80" w:type="dxa"/>
-            </w:tcMar>
-          </w:tcPr>
-          <w:p>
-            <w:pPr>
-              <w:jc w:val="center"/>
-            </w:pPr>
-            <w:r>
-              <w:rPr>
-                <w:rFonts w:ascii="Times New Roman" w:hAnsi="Times New Roman"/>
-                <w:b w:val="0"/>
-                <w:sz w:val="19"/>
-              </w:rPr>
-              <w:t>AE4319796</w:t>
-            </w:r>
-          </w:p>
-        </w:tc>
-        <w:tc>
-          <w:tcPr>
-            <w:tcW w:type="dxa" w:w="1800"/>
-            <w:shd w:fill="FEF3C7"/>
-            <w:tcMar>
-              <w:top w:w="80" w:type="dxa"/>
-              <w:bottom w:w="80" w:type="dxa"/>
-              <w:left w:w="80" w:type="dxa"/>
-              <w:right w:w="80" w:type="dxa"/>
-            </w:tcMar>
-          </w:tcPr>
-          <w:p>
-            <w:pPr>
-              <w:jc w:val="center"/>
-            </w:pPr>
-            <w:r>
-              <w:rPr>
-                <w:rFonts w:ascii="Times New Roman" w:hAnsi="Times New Roman"/>
-                <w:b w:val="0"/>
-                <w:sz w:val="19"/>
-              </w:rPr>
-              <w:t>+998 97 618-02-59</w:t>
+              <w:t>+998 88 100-95-04 / +998 97 632-55-74 (Otasi / Onasi)</w:t>
             </w:r>
           </w:p>
         </w:tc>
@@ -5977,7 +5025,7 @@
                 <w:b w:val="0"/>
                 <w:sz w:val="19"/>
               </w:rPr>
-              <w:t>4</w:t>
+              <w:t>3</w:t>
             </w:r>
           </w:p>
         </w:tc>
@@ -6399,7 +5447,7 @@
                 <w:b w:val="0"/>
                 <w:sz w:val="19"/>
               </w:rPr>
-              <w:t>+998 70 034-95-05</w:t>
+              <w:t>+998 70 034-95-05 / +998 99 468-84-06 (Otasi / Onasi)</w:t>
             </w:r>
           </w:p>
         </w:tc>
@@ -7059,353 +6107,6 @@
         </w:tc>
       </w:tr>
     </w:tbl>
-    <w:p>
-      <w:pPr>
-        <w:spacing w:before="280" w:after="120"/>
-      </w:pPr>
-      <w:r>
-        <w:rPr>
-          <w:rFonts w:ascii="Times New Roman" w:hAnsi="Times New Roman"/>
-          <w:b/>
-          <w:color w:val="312E81"/>
-          <w:sz w:val="24"/>
-        </w:rPr>
-        <w:t>📌 26-07 GURUHI — SO'ROVNOMA TOPSHIRMAGAN TALABALAR (1 NAFAR)</w:t>
-      </w:r>
-      <w:r>
-        <w:rPr>
-          <w:rFonts w:ascii="Times New Roman" w:hAnsi="Times New Roman"/>
-          <w:i/>
-          <w:sz w:val="22"/>
-        </w:rPr>
-        <w:t xml:space="preserve">  |  Guruh rahbari: Asraliyev.A</w:t>
-      </w:r>
-    </w:p>
-    <w:tbl>
-      <w:tblPr>
-        <w:tblW w:type="auto" w:w="0"/>
-        <w:jc w:val="center"/>
-        <w:tblLook w:firstColumn="1" w:firstRow="1" w:lastColumn="0" w:lastRow="0" w:noHBand="0" w:noVBand="1" w:val="04A0"/>
-      </w:tblPr>
-      <w:tblGrid>
-        <w:gridCol w:w="1800"/>
-        <w:gridCol w:w="1800"/>
-        <w:gridCol w:w="1800"/>
-        <w:gridCol w:w="1800"/>
-        <w:gridCol w:w="1800"/>
-        <w:gridCol w:w="1800"/>
-      </w:tblGrid>
-      <w:tr>
-        <w:tc>
-          <w:tcPr>
-            <w:tcW w:type="dxa" w:w="1800"/>
-            <w:shd w:fill="312E81"/>
-            <w:tcMar>
-              <w:top w:w="100" w:type="dxa"/>
-              <w:bottom w:w="100" w:type="dxa"/>
-              <w:left w:w="80" w:type="dxa"/>
-              <w:right w:w="80" w:type="dxa"/>
-            </w:tcMar>
-          </w:tcPr>
-          <w:p>
-            <w:pPr>
-              <w:jc w:val="center"/>
-            </w:pPr>
-            <w:r>
-              <w:rPr>
-                <w:rFonts w:ascii="Times New Roman" w:hAnsi="Times New Roman"/>
-                <w:b/>
-                <w:color w:val="FFFFFF"/>
-                <w:sz w:val="19"/>
-              </w:rPr>
-              <w:t>№</w:t>
-            </w:r>
-          </w:p>
-        </w:tc>
-        <w:tc>
-          <w:tcPr>
-            <w:tcW w:type="dxa" w:w="1800"/>
-            <w:shd w:fill="312E81"/>
-            <w:tcMar>
-              <w:top w:w="100" w:type="dxa"/>
-              <w:bottom w:w="100" w:type="dxa"/>
-              <w:left w:w="80" w:type="dxa"/>
-              <w:right w:w="80" w:type="dxa"/>
-            </w:tcMar>
-          </w:tcPr>
-          <w:p>
-            <w:pPr>
-              <w:jc w:val="center"/>
-            </w:pPr>
-            <w:r>
-              <w:rPr>
-                <w:rFonts w:ascii="Times New Roman" w:hAnsi="Times New Roman"/>
-                <w:b/>
-                <w:color w:val="FFFFFF"/>
-                <w:sz w:val="19"/>
-              </w:rPr>
-              <w:t>Talaba Familiyasi, Ismi, Otasining ismi</w:t>
-            </w:r>
-          </w:p>
-        </w:tc>
-        <w:tc>
-          <w:tcPr>
-            <w:tcW w:type="dxa" w:w="1800"/>
-            <w:shd w:fill="312E81"/>
-            <w:tcMar>
-              <w:top w:w="100" w:type="dxa"/>
-              <w:bottom w:w="100" w:type="dxa"/>
-              <w:left w:w="80" w:type="dxa"/>
-              <w:right w:w="80" w:type="dxa"/>
-            </w:tcMar>
-          </w:tcPr>
-          <w:p>
-            <w:pPr>
-              <w:jc w:val="center"/>
-            </w:pPr>
-            <w:r>
-              <w:rPr>
-                <w:rFonts w:ascii="Times New Roman" w:hAnsi="Times New Roman"/>
-                <w:b/>
-                <w:color w:val="FFFFFF"/>
-                <w:sz w:val="19"/>
-              </w:rPr>
-              <w:t>Pasport №</w:t>
-            </w:r>
-          </w:p>
-        </w:tc>
-        <w:tc>
-          <w:tcPr>
-            <w:tcW w:type="dxa" w:w="1800"/>
-            <w:shd w:fill="312E81"/>
-            <w:tcMar>
-              <w:top w:w="100" w:type="dxa"/>
-              <w:bottom w:w="100" w:type="dxa"/>
-              <w:left w:w="80" w:type="dxa"/>
-              <w:right w:w="80" w:type="dxa"/>
-            </w:tcMar>
-          </w:tcPr>
-          <w:p>
-            <w:pPr>
-              <w:jc w:val="center"/>
-            </w:pPr>
-            <w:r>
-              <w:rPr>
-                <w:rFonts w:ascii="Times New Roman" w:hAnsi="Times New Roman"/>
-                <w:b/>
-                <w:color w:val="FFFFFF"/>
-                <w:sz w:val="19"/>
-              </w:rPr>
-              <w:t>Telefon raqami</w:t>
-            </w:r>
-          </w:p>
-        </w:tc>
-        <w:tc>
-          <w:tcPr>
-            <w:tcW w:type="dxa" w:w="1800"/>
-            <w:shd w:fill="312E81"/>
-            <w:tcMar>
-              <w:top w:w="100" w:type="dxa"/>
-              <w:bottom w:w="100" w:type="dxa"/>
-              <w:left w:w="80" w:type="dxa"/>
-              <w:right w:w="80" w:type="dxa"/>
-            </w:tcMar>
-          </w:tcPr>
-          <w:p>
-            <w:pPr>
-              <w:jc w:val="center"/>
-            </w:pPr>
-            <w:r>
-              <w:rPr>
-                <w:rFonts w:ascii="Times New Roman" w:hAnsi="Times New Roman"/>
-                <w:b/>
-                <w:color w:val="FFFFFF"/>
-                <w:sz w:val="19"/>
-              </w:rPr>
-              <w:t>Holati</w:t>
-            </w:r>
-          </w:p>
-        </w:tc>
-        <w:tc>
-          <w:tcPr>
-            <w:tcW w:type="dxa" w:w="1800"/>
-            <w:shd w:fill="312E81"/>
-            <w:tcMar>
-              <w:top w:w="100" w:type="dxa"/>
-              <w:bottom w:w="100" w:type="dxa"/>
-              <w:left w:w="80" w:type="dxa"/>
-              <w:right w:w="80" w:type="dxa"/>
-            </w:tcMar>
-          </w:tcPr>
-          <w:p>
-            <w:pPr>
-              <w:jc w:val="center"/>
-            </w:pPr>
-            <w:r>
-              <w:rPr>
-                <w:rFonts w:ascii="Times New Roman" w:hAnsi="Times New Roman"/>
-                <w:b/>
-                <w:color w:val="FFFFFF"/>
-                <w:sz w:val="19"/>
-              </w:rPr>
-              <w:t>Guruh rahbari qaydi / Yangi manzil</w:t>
-            </w:r>
-          </w:p>
-        </w:tc>
-      </w:tr>
-      <w:tr>
-        <w:tc>
-          <w:tcPr>
-            <w:tcW w:type="dxa" w:w="1800"/>
-            <w:shd w:fill="FEE2E2"/>
-            <w:tcMar>
-              <w:top w:w="80" w:type="dxa"/>
-              <w:bottom w:w="80" w:type="dxa"/>
-              <w:left w:w="80" w:type="dxa"/>
-              <w:right w:w="80" w:type="dxa"/>
-            </w:tcMar>
-          </w:tcPr>
-          <w:p>
-            <w:pPr>
-              <w:jc w:val="center"/>
-            </w:pPr>
-            <w:r>
-              <w:rPr>
-                <w:rFonts w:ascii="Times New Roman" w:hAnsi="Times New Roman"/>
-                <w:b w:val="0"/>
-                <w:sz w:val="19"/>
-              </w:rPr>
-              <w:t>1</w:t>
-            </w:r>
-          </w:p>
-        </w:tc>
-        <w:tc>
-          <w:tcPr>
-            <w:tcW w:type="dxa" w:w="1800"/>
-            <w:shd w:fill="FEE2E2"/>
-            <w:tcMar>
-              <w:top w:w="80" w:type="dxa"/>
-              <w:bottom w:w="80" w:type="dxa"/>
-              <w:left w:w="80" w:type="dxa"/>
-              <w:right w:w="80" w:type="dxa"/>
-            </w:tcMar>
-          </w:tcPr>
-          <w:p>
-            <w:pPr>
-              <w:jc w:val="left"/>
-            </w:pPr>
-            <w:r>
-              <w:rPr>
-                <w:rFonts w:ascii="Times New Roman" w:hAnsi="Times New Roman"/>
-                <w:b/>
-                <w:sz w:val="19"/>
-              </w:rPr>
-              <w:t>Ergasheva Madina Tulqin qizi</w:t>
-            </w:r>
-          </w:p>
-        </w:tc>
-        <w:tc>
-          <w:tcPr>
-            <w:tcW w:type="dxa" w:w="1800"/>
-            <w:shd w:fill="FEE2E2"/>
-            <w:tcMar>
-              <w:top w:w="80" w:type="dxa"/>
-              <w:bottom w:w="80" w:type="dxa"/>
-              <w:left w:w="80" w:type="dxa"/>
-              <w:right w:w="80" w:type="dxa"/>
-            </w:tcMar>
-          </w:tcPr>
-          <w:p>
-            <w:pPr>
-              <w:jc w:val="center"/>
-            </w:pPr>
-            <w:r>
-              <w:rPr>
-                <w:rFonts w:ascii="Times New Roman" w:hAnsi="Times New Roman"/>
-                <w:b w:val="0"/>
-                <w:sz w:val="19"/>
-              </w:rPr>
-              <w:t>AC0429133</w:t>
-            </w:r>
-          </w:p>
-        </w:tc>
-        <w:tc>
-          <w:tcPr>
-            <w:tcW w:type="dxa" w:w="1800"/>
-            <w:shd w:fill="FEE2E2"/>
-            <w:tcMar>
-              <w:top w:w="80" w:type="dxa"/>
-              <w:bottom w:w="80" w:type="dxa"/>
-              <w:left w:w="80" w:type="dxa"/>
-              <w:right w:w="80" w:type="dxa"/>
-            </w:tcMar>
-          </w:tcPr>
-          <w:p>
-            <w:pPr>
-              <w:jc w:val="center"/>
-            </w:pPr>
-            <w:r>
-              <w:rPr>
-                <w:rFonts w:ascii="Times New Roman" w:hAnsi="Times New Roman"/>
-                <w:b w:val="0"/>
-                <w:sz w:val="19"/>
-              </w:rPr>
-              <w:t>Mavjud emas</w:t>
-            </w:r>
-          </w:p>
-        </w:tc>
-        <w:tc>
-          <w:tcPr>
-            <w:tcW w:type="dxa" w:w="1800"/>
-            <w:shd w:fill="FEE2E2"/>
-            <w:tcMar>
-              <w:top w:w="80" w:type="dxa"/>
-              <w:bottom w:w="80" w:type="dxa"/>
-              <w:left w:w="80" w:type="dxa"/>
-              <w:right w:w="80" w:type="dxa"/>
-            </w:tcMar>
-          </w:tcPr>
-          <w:p>
-            <w:pPr>
-              <w:jc w:val="center"/>
-            </w:pPr>
-            <w:r>
-              <w:rPr>
-                <w:rFonts w:ascii="Times New Roman" w:hAnsi="Times New Roman"/>
-                <w:b/>
-                <w:color w:val="991B1B"/>
-                <w:sz w:val="19"/>
-              </w:rPr>
-              <w:t>🔴 Telefoni yo'q</w:t>
-            </w:r>
-          </w:p>
-        </w:tc>
-        <w:tc>
-          <w:tcPr>
-            <w:tcW w:type="dxa" w:w="1800"/>
-            <w:shd w:fill="FFFFFF"/>
-            <w:tcMar>
-              <w:top w:w="80" w:type="dxa"/>
-              <w:bottom w:w="80" w:type="dxa"/>
-              <w:left w:w="80" w:type="dxa"/>
-              <w:right w:w="80" w:type="dxa"/>
-            </w:tcMar>
-          </w:tcPr>
-          <w:p>
-            <w:pPr>
-              <w:jc w:val="left"/>
-            </w:pPr>
-            <w:r>
-              <w:rPr>
-                <w:rFonts w:ascii="Times New Roman" w:hAnsi="Times New Roman"/>
-                <w:b w:val="0"/>
-                <w:sz w:val="19"/>
-              </w:rPr>
-            </w:r>
-          </w:p>
-        </w:tc>
-      </w:tr>
-    </w:tbl>
     <w:sectPr>
       <w:pgSz w:w="12240" w:h="15840"/>
       <w:pgMar w:top="720" w:right="720" w:bottom="720" w:left="720" w:header="720" w:footer="720" w:gutter="0"/>

</xml_diff>

<commit_message>
feat(survey): yangi so'rovnoma ma'lumotlari kiritildi (Niyozova Komila, 26-03), davomat va hisobotlar yangilandi
</commit_message>
<xml_diff>
--- a/hisobotlar/1-kurs_Sorovnoma_Topshirmaganlar_Hisoboti.docx
+++ b/hisobotlar/1-kurs_Sorovnoma_Topshirmaganlar_Hisoboti.docx
@@ -708,7 +708,7 @@
                 <w:b w:val="0"/>
                 <w:sz w:val="19"/>
               </w:rPr>
-              <w:t>24</w:t>
+              <w:t>25</w:t>
             </w:r>
           </w:p>
         </w:tc>
@@ -733,7 +733,7 @@
                 <w:b/>
                 <w:sz w:val="19"/>
               </w:rPr>
-              <w:t>10</w:t>
+              <w:t>9</w:t>
             </w:r>
           </w:p>
         </w:tc>
@@ -758,7 +758,7 @@
                 <w:b w:val="0"/>
                 <w:sz w:val="19"/>
               </w:rPr>
-              <w:t>70.6%</w:t>
+              <w:t>73.5%</w:t>
             </w:r>
           </w:p>
         </w:tc>
@@ -1591,7 +1591,7 @@
                 <w:b/>
                 <w:sz w:val="20"/>
               </w:rPr>
-              <w:t>157</w:t>
+              <w:t>158</w:t>
             </w:r>
           </w:p>
         </w:tc>
@@ -1616,7 +1616,7 @@
                 <w:b/>
                 <w:sz w:val="20"/>
               </w:rPr>
-              <w:t>23</w:t>
+              <w:t>22</w:t>
             </w:r>
           </w:p>
         </w:tc>
@@ -1641,7 +1641,7 @@
                 <w:b/>
                 <w:sz w:val="20"/>
               </w:rPr>
-              <w:t>87.2%</w:t>
+              <w:t>87.8%</w:t>
             </w:r>
           </w:p>
         </w:tc>
@@ -2312,7 +2312,7 @@
           <w:color w:val="312E81"/>
           <w:sz w:val="24"/>
         </w:rPr>
-        <w:t>📌 26-03 GURUHI — SO'ROVNOMA TOPSHIRMAGAN TALABALAR (10 NAFAR)</w:t>
+        <w:t>📌 26-03 GURUHI — SO'ROVNOMA TOPSHIRMAGAN TALABALAR (9 NAFAR)</w:t>
       </w:r>
       <w:r>
         <w:rPr>
@@ -3256,7 +3256,7 @@
         <w:tc>
           <w:tcPr>
             <w:tcW w:type="dxa" w:w="1800"/>
-            <w:shd w:fill="FEE2E2"/>
+            <w:shd w:fill="FEF3C7"/>
             <w:tcMar>
               <w:top w:w="80" w:type="dxa"/>
               <w:bottom w:w="80" w:type="dxa"/>
@@ -3275,158 +3275,6 @@
                 <w:sz w:val="19"/>
               </w:rPr>
               <w:t>6</w:t>
-            </w:r>
-          </w:p>
-        </w:tc>
-        <w:tc>
-          <w:tcPr>
-            <w:tcW w:type="dxa" w:w="1800"/>
-            <w:shd w:fill="FEE2E2"/>
-            <w:tcMar>
-              <w:top w:w="80" w:type="dxa"/>
-              <w:bottom w:w="80" w:type="dxa"/>
-              <w:left w:w="80" w:type="dxa"/>
-              <w:right w:w="80" w:type="dxa"/>
-            </w:tcMar>
-          </w:tcPr>
-          <w:p>
-            <w:pPr>
-              <w:jc w:val="left"/>
-            </w:pPr>
-            <w:r>
-              <w:rPr>
-                <w:rFonts w:ascii="Times New Roman" w:hAnsi="Times New Roman"/>
-                <w:b/>
-                <w:sz w:val="19"/>
-              </w:rPr>
-              <w:t>Niyozova Komila Toshpulatovna</w:t>
-            </w:r>
-          </w:p>
-        </w:tc>
-        <w:tc>
-          <w:tcPr>
-            <w:tcW w:type="dxa" w:w="1800"/>
-            <w:shd w:fill="FEE2E2"/>
-            <w:tcMar>
-              <w:top w:w="80" w:type="dxa"/>
-              <w:bottom w:w="80" w:type="dxa"/>
-              <w:left w:w="80" w:type="dxa"/>
-              <w:right w:w="80" w:type="dxa"/>
-            </w:tcMar>
-          </w:tcPr>
-          <w:p>
-            <w:pPr>
-              <w:jc w:val="center"/>
-            </w:pPr>
-            <w:r>
-              <w:rPr>
-                <w:rFonts w:ascii="Times New Roman" w:hAnsi="Times New Roman"/>
-                <w:b w:val="0"/>
-                <w:sz w:val="19"/>
-              </w:rPr>
-              <w:t>AB9205278</w:t>
-            </w:r>
-          </w:p>
-        </w:tc>
-        <w:tc>
-          <w:tcPr>
-            <w:tcW w:type="dxa" w:w="1800"/>
-            <w:shd w:fill="FEE2E2"/>
-            <w:tcMar>
-              <w:top w:w="80" w:type="dxa"/>
-              <w:bottom w:w="80" w:type="dxa"/>
-              <w:left w:w="80" w:type="dxa"/>
-              <w:right w:w="80" w:type="dxa"/>
-            </w:tcMar>
-          </w:tcPr>
-          <w:p>
-            <w:pPr>
-              <w:jc w:val="center"/>
-            </w:pPr>
-            <w:r>
-              <w:rPr>
-                <w:rFonts w:ascii="Times New Roman" w:hAnsi="Times New Roman"/>
-                <w:b w:val="0"/>
-                <w:sz w:val="19"/>
-              </w:rPr>
-              <w:t>Mavjud emas</w:t>
-            </w:r>
-          </w:p>
-        </w:tc>
-        <w:tc>
-          <w:tcPr>
-            <w:tcW w:type="dxa" w:w="1800"/>
-            <w:shd w:fill="FEE2E2"/>
-            <w:tcMar>
-              <w:top w:w="80" w:type="dxa"/>
-              <w:bottom w:w="80" w:type="dxa"/>
-              <w:left w:w="80" w:type="dxa"/>
-              <w:right w:w="80" w:type="dxa"/>
-            </w:tcMar>
-          </w:tcPr>
-          <w:p>
-            <w:pPr>
-              <w:jc w:val="center"/>
-            </w:pPr>
-            <w:r>
-              <w:rPr>
-                <w:rFonts w:ascii="Times New Roman" w:hAnsi="Times New Roman"/>
-                <w:b/>
-                <w:color w:val="991B1B"/>
-                <w:sz w:val="19"/>
-              </w:rPr>
-              <w:t>🔴 Telefoni yo'q</w:t>
-            </w:r>
-          </w:p>
-        </w:tc>
-        <w:tc>
-          <w:tcPr>
-            <w:tcW w:type="dxa" w:w="1800"/>
-            <w:shd w:fill="FFFFFF"/>
-            <w:tcMar>
-              <w:top w:w="80" w:type="dxa"/>
-              <w:bottom w:w="80" w:type="dxa"/>
-              <w:left w:w="80" w:type="dxa"/>
-              <w:right w:w="80" w:type="dxa"/>
-            </w:tcMar>
-          </w:tcPr>
-          <w:p>
-            <w:pPr>
-              <w:jc w:val="left"/>
-            </w:pPr>
-            <w:r>
-              <w:rPr>
-                <w:rFonts w:ascii="Times New Roman" w:hAnsi="Times New Roman"/>
-                <w:b w:val="0"/>
-                <w:sz w:val="19"/>
-              </w:rPr>
-            </w:r>
-          </w:p>
-        </w:tc>
-      </w:tr>
-      <w:tr>
-        <w:tc>
-          <w:tcPr>
-            <w:tcW w:type="dxa" w:w="1800"/>
-            <w:shd w:fill="FEF3C7"/>
-            <w:tcMar>
-              <w:top w:w="80" w:type="dxa"/>
-              <w:bottom w:w="80" w:type="dxa"/>
-              <w:left w:w="80" w:type="dxa"/>
-              <w:right w:w="80" w:type="dxa"/>
-            </w:tcMar>
-          </w:tcPr>
-          <w:p>
-            <w:pPr>
-              <w:jc w:val="center"/>
-            </w:pPr>
-            <w:r>
-              <w:rPr>
-                <w:rFonts w:ascii="Times New Roman" w:hAnsi="Times New Roman"/>
-                <w:b w:val="0"/>
-                <w:sz w:val="19"/>
-              </w:rPr>
-              <w:t>7</w:t>
             </w:r>
           </w:p>
         </w:tc>
@@ -3577,7 +3425,7 @@
                 <w:b w:val="0"/>
                 <w:sz w:val="19"/>
               </w:rPr>
-              <w:t>8</w:t>
+              <w:t>7</w:t>
             </w:r>
           </w:p>
         </w:tc>
@@ -3729,7 +3577,7 @@
                 <w:b w:val="0"/>
                 <w:sz w:val="19"/>
               </w:rPr>
-              <w:t>9</w:t>
+              <w:t>8</w:t>
             </w:r>
           </w:p>
         </w:tc>
@@ -3880,7 +3728,7 @@
                 <w:b w:val="0"/>
                 <w:sz w:val="19"/>
               </w:rPr>
-              <w:t>10</w:t>
+              <w:t>9</w:t>
             </w:r>
           </w:p>
         </w:tc>

</xml_diff>

<commit_message>
fix(export): barcha yangi kiritilgan talabalar eksportlarga to'liq kiritildi va real-vaqtda olinishi ta'minlandi
</commit_message>
<xml_diff>
--- a/hisobotlar/1-kurs_Sorovnoma_Topshirmaganlar_Hisoboti.docx
+++ b/hisobotlar/1-kurs_Sorovnoma_Topshirmaganlar_Hisoboti.docx
@@ -329,7 +329,7 @@
                 <w:b/>
                 <w:sz w:val="19"/>
               </w:rPr>
-              <w:t>14</w:t>
+              <w:t>15</w:t>
             </w:r>
           </w:p>
         </w:tc>
@@ -361,7 +361,7 @@
         <w:tc>
           <w:tcPr>
             <w:tcW w:type="dxa" w:w="1543"/>
-            <w:shd w:fill="FFFFFF"/>
+            <w:shd w:fill="FEF3C7"/>
             <w:tcMar>
               <w:top w:w="80" w:type="dxa"/>
               <w:bottom w:w="80" w:type="dxa"/>
@@ -379,7 +379,7 @@
                 <w:b/>
                 <w:sz w:val="19"/>
               </w:rPr>
-              <w:t>0</w:t>
+              <w:t>1</w:t>
             </w:r>
           </w:p>
         </w:tc>
@@ -404,7 +404,7 @@
                 <w:b w:val="0"/>
                 <w:sz w:val="19"/>
               </w:rPr>
-              <w:t>100.0%</w:t>
+              <w:t>93.3%</w:t>
             </w:r>
           </w:p>
         </w:tc>
@@ -1391,7 +1391,7 @@
                 <w:b/>
                 <w:sz w:val="19"/>
               </w:rPr>
-              <w:t>0</w:t>
+              <w:t>1</w:t>
             </w:r>
           </w:p>
         </w:tc>
@@ -1423,7 +1423,7 @@
         <w:tc>
           <w:tcPr>
             <w:tcW w:type="dxa" w:w="1543"/>
-            <w:shd w:fill="FFFFFF"/>
+            <w:shd w:fill="FEF3C7"/>
             <w:tcMar>
               <w:top w:w="80" w:type="dxa"/>
               <w:bottom w:w="80" w:type="dxa"/>
@@ -1441,7 +1441,7 @@
                 <w:b/>
                 <w:sz w:val="19"/>
               </w:rPr>
-              <w:t>0</w:t>
+              <w:t>1</w:t>
             </w:r>
           </w:p>
         </w:tc>
@@ -1566,7 +1566,7 @@
                 <w:b/>
                 <w:sz w:val="20"/>
               </w:rPr>
-              <w:t>180</w:t>
+              <w:t>182</w:t>
             </w:r>
           </w:p>
         </w:tc>
@@ -1616,7 +1616,7 @@
                 <w:b/>
                 <w:sz w:val="20"/>
               </w:rPr>
-              <w:t>22</w:t>
+              <w:t>24</w:t>
             </w:r>
           </w:p>
         </w:tc>
@@ -1641,7 +1641,7 @@
                 <w:b/>
                 <w:sz w:val="20"/>
               </w:rPr>
-              <w:t>87.8%</w:t>
+              <w:t>86.8%</w:t>
             </w:r>
           </w:p>
         </w:tc>
@@ -1663,7 +1663,7 @@
           <w:color w:val="312E81"/>
           <w:sz w:val="24"/>
         </w:rPr>
-        <w:t>📌 26-02 GURUHI — SO'ROVNOMA TOPSHIRMAGAN TALABALAR (3 NAFAR)</w:t>
+        <w:t>📌 26-01 GURUHI — SO'ROVNOMA TOPSHIRMAGAN TALABALAR (1 NAFAR)</w:t>
       </w:r>
       <w:r>
         <w:rPr>
@@ -1671,7 +1671,7 @@
           <w:i/>
           <w:sz w:val="22"/>
         </w:rPr>
-        <w:t xml:space="preserve">  |  Guruh rahbari: Ochilov.D</w:t>
+        <w:t xml:space="preserve">  |  Guruh rahbari: Mirzayeva.D</w:t>
       </w:r>
     </w:p>
     <w:tbl>
@@ -1893,7 +1893,7 @@
                 <w:b/>
                 <w:sz w:val="19"/>
               </w:rPr>
-              <w:t>Nurillayeva Dilsuz Mashrabovna</w:t>
+              <w:t>Shermatova Gulsun Xurshid qizi</w:t>
             </w:r>
           </w:p>
         </w:tc>
@@ -1918,7 +1918,7 @@
                 <w:b w:val="0"/>
                 <w:sz w:val="19"/>
               </w:rPr>
-              <w:t>AD4774693</w:t>
+              <w:t>AE5836574</w:t>
             </w:r>
           </w:p>
         </w:tc>
@@ -1998,6 +1998,201 @@
           </w:p>
         </w:tc>
       </w:tr>
+    </w:tbl>
+    <w:p>
+      <w:pPr>
+        <w:spacing w:before="280" w:after="120"/>
+      </w:pPr>
+      <w:r>
+        <w:rPr>
+          <w:rFonts w:ascii="Times New Roman" w:hAnsi="Times New Roman"/>
+          <w:b/>
+          <w:color w:val="312E81"/>
+          <w:sz w:val="24"/>
+        </w:rPr>
+        <w:t>📌 26-02 GURUHI — SO'ROVNOMA TOPSHIRMAGAN TALABALAR (3 NAFAR)</w:t>
+      </w:r>
+      <w:r>
+        <w:rPr>
+          <w:rFonts w:ascii="Times New Roman" w:hAnsi="Times New Roman"/>
+          <w:i/>
+          <w:sz w:val="22"/>
+        </w:rPr>
+        <w:t xml:space="preserve">  |  Guruh rahbari: Ochilov.D</w:t>
+      </w:r>
+    </w:p>
+    <w:tbl>
+      <w:tblPr>
+        <w:tblW w:type="auto" w:w="0"/>
+        <w:jc w:val="center"/>
+        <w:tblLook w:firstColumn="1" w:firstRow="1" w:lastColumn="0" w:lastRow="0" w:noHBand="0" w:noVBand="1" w:val="04A0"/>
+      </w:tblPr>
+      <w:tblGrid>
+        <w:gridCol w:w="1800"/>
+        <w:gridCol w:w="1800"/>
+        <w:gridCol w:w="1800"/>
+        <w:gridCol w:w="1800"/>
+        <w:gridCol w:w="1800"/>
+        <w:gridCol w:w="1800"/>
+      </w:tblGrid>
+      <w:tr>
+        <w:tc>
+          <w:tcPr>
+            <w:tcW w:type="dxa" w:w="1800"/>
+            <w:shd w:fill="312E81"/>
+            <w:tcMar>
+              <w:top w:w="100" w:type="dxa"/>
+              <w:bottom w:w="100" w:type="dxa"/>
+              <w:left w:w="80" w:type="dxa"/>
+              <w:right w:w="80" w:type="dxa"/>
+            </w:tcMar>
+          </w:tcPr>
+          <w:p>
+            <w:pPr>
+              <w:jc w:val="center"/>
+            </w:pPr>
+            <w:r>
+              <w:rPr>
+                <w:rFonts w:ascii="Times New Roman" w:hAnsi="Times New Roman"/>
+                <w:b/>
+                <w:color w:val="FFFFFF"/>
+                <w:sz w:val="19"/>
+              </w:rPr>
+              <w:t>№</w:t>
+            </w:r>
+          </w:p>
+        </w:tc>
+        <w:tc>
+          <w:tcPr>
+            <w:tcW w:type="dxa" w:w="1800"/>
+            <w:shd w:fill="312E81"/>
+            <w:tcMar>
+              <w:top w:w="100" w:type="dxa"/>
+              <w:bottom w:w="100" w:type="dxa"/>
+              <w:left w:w="80" w:type="dxa"/>
+              <w:right w:w="80" w:type="dxa"/>
+            </w:tcMar>
+          </w:tcPr>
+          <w:p>
+            <w:pPr>
+              <w:jc w:val="center"/>
+            </w:pPr>
+            <w:r>
+              <w:rPr>
+                <w:rFonts w:ascii="Times New Roman" w:hAnsi="Times New Roman"/>
+                <w:b/>
+                <w:color w:val="FFFFFF"/>
+                <w:sz w:val="19"/>
+              </w:rPr>
+              <w:t>Talaba Familiyasi, Ismi, Otasining ismi</w:t>
+            </w:r>
+          </w:p>
+        </w:tc>
+        <w:tc>
+          <w:tcPr>
+            <w:tcW w:type="dxa" w:w="1800"/>
+            <w:shd w:fill="312E81"/>
+            <w:tcMar>
+              <w:top w:w="100" w:type="dxa"/>
+              <w:bottom w:w="100" w:type="dxa"/>
+              <w:left w:w="80" w:type="dxa"/>
+              <w:right w:w="80" w:type="dxa"/>
+            </w:tcMar>
+          </w:tcPr>
+          <w:p>
+            <w:pPr>
+              <w:jc w:val="center"/>
+            </w:pPr>
+            <w:r>
+              <w:rPr>
+                <w:rFonts w:ascii="Times New Roman" w:hAnsi="Times New Roman"/>
+                <w:b/>
+                <w:color w:val="FFFFFF"/>
+                <w:sz w:val="19"/>
+              </w:rPr>
+              <w:t>Pasport №</w:t>
+            </w:r>
+          </w:p>
+        </w:tc>
+        <w:tc>
+          <w:tcPr>
+            <w:tcW w:type="dxa" w:w="1800"/>
+            <w:shd w:fill="312E81"/>
+            <w:tcMar>
+              <w:top w:w="100" w:type="dxa"/>
+              <w:bottom w:w="100" w:type="dxa"/>
+              <w:left w:w="80" w:type="dxa"/>
+              <w:right w:w="80" w:type="dxa"/>
+            </w:tcMar>
+          </w:tcPr>
+          <w:p>
+            <w:pPr>
+              <w:jc w:val="center"/>
+            </w:pPr>
+            <w:r>
+              <w:rPr>
+                <w:rFonts w:ascii="Times New Roman" w:hAnsi="Times New Roman"/>
+                <w:b/>
+                <w:color w:val="FFFFFF"/>
+                <w:sz w:val="19"/>
+              </w:rPr>
+              <w:t>Telefon raqami</w:t>
+            </w:r>
+          </w:p>
+        </w:tc>
+        <w:tc>
+          <w:tcPr>
+            <w:tcW w:type="dxa" w:w="1800"/>
+            <w:shd w:fill="312E81"/>
+            <w:tcMar>
+              <w:top w:w="100" w:type="dxa"/>
+              <w:bottom w:w="100" w:type="dxa"/>
+              <w:left w:w="80" w:type="dxa"/>
+              <w:right w:w="80" w:type="dxa"/>
+            </w:tcMar>
+          </w:tcPr>
+          <w:p>
+            <w:pPr>
+              <w:jc w:val="center"/>
+            </w:pPr>
+            <w:r>
+              <w:rPr>
+                <w:rFonts w:ascii="Times New Roman" w:hAnsi="Times New Roman"/>
+                <w:b/>
+                <w:color w:val="FFFFFF"/>
+                <w:sz w:val="19"/>
+              </w:rPr>
+              <w:t>Holati</w:t>
+            </w:r>
+          </w:p>
+        </w:tc>
+        <w:tc>
+          <w:tcPr>
+            <w:tcW w:type="dxa" w:w="1800"/>
+            <w:shd w:fill="312E81"/>
+            <w:tcMar>
+              <w:top w:w="100" w:type="dxa"/>
+              <w:bottom w:w="100" w:type="dxa"/>
+              <w:left w:w="80" w:type="dxa"/>
+              <w:right w:w="80" w:type="dxa"/>
+            </w:tcMar>
+          </w:tcPr>
+          <w:p>
+            <w:pPr>
+              <w:jc w:val="center"/>
+            </w:pPr>
+            <w:r>
+              <w:rPr>
+                <w:rFonts w:ascii="Times New Roman" w:hAnsi="Times New Roman"/>
+                <w:b/>
+                <w:color w:val="FFFFFF"/>
+                <w:sz w:val="19"/>
+              </w:rPr>
+              <w:t>Guruh rahbari qaydi / Yangi manzil</w:t>
+            </w:r>
+          </w:p>
+        </w:tc>
+      </w:tr>
       <w:tr>
         <w:tc>
           <w:tcPr>
@@ -2020,7 +2215,7 @@
                 <w:b w:val="0"/>
                 <w:sz w:val="19"/>
               </w:rPr>
-              <w:t>2</w:t>
+              <w:t>1</w:t>
             </w:r>
           </w:p>
         </w:tc>
@@ -2171,7 +2366,7 @@
                 <w:b w:val="0"/>
                 <w:sz w:val="19"/>
               </w:rPr>
-              <w:t>3</w:t>
+              <w:t>2</w:t>
             </w:r>
           </w:p>
         </w:tc>
@@ -2272,6 +2467,158 @@
                 <w:sz w:val="19"/>
               </w:rPr>
               <w:t>🟡 Telefoni bor</w:t>
+            </w:r>
+          </w:p>
+        </w:tc>
+        <w:tc>
+          <w:tcPr>
+            <w:tcW w:type="dxa" w:w="1800"/>
+            <w:shd w:fill="FFFFFF"/>
+            <w:tcMar>
+              <w:top w:w="80" w:type="dxa"/>
+              <w:bottom w:w="80" w:type="dxa"/>
+              <w:left w:w="80" w:type="dxa"/>
+              <w:right w:w="80" w:type="dxa"/>
+            </w:tcMar>
+          </w:tcPr>
+          <w:p>
+            <w:pPr>
+              <w:jc w:val="left"/>
+            </w:pPr>
+            <w:r>
+              <w:rPr>
+                <w:rFonts w:ascii="Times New Roman" w:hAnsi="Times New Roman"/>
+                <w:b w:val="0"/>
+                <w:sz w:val="19"/>
+              </w:rPr>
+            </w:r>
+          </w:p>
+        </w:tc>
+      </w:tr>
+      <w:tr>
+        <w:tc>
+          <w:tcPr>
+            <w:tcW w:type="dxa" w:w="1800"/>
+            <w:shd w:fill="FEE2E2"/>
+            <w:tcMar>
+              <w:top w:w="80" w:type="dxa"/>
+              <w:bottom w:w="80" w:type="dxa"/>
+              <w:left w:w="80" w:type="dxa"/>
+              <w:right w:w="80" w:type="dxa"/>
+            </w:tcMar>
+          </w:tcPr>
+          <w:p>
+            <w:pPr>
+              <w:jc w:val="center"/>
+            </w:pPr>
+            <w:r>
+              <w:rPr>
+                <w:rFonts w:ascii="Times New Roman" w:hAnsi="Times New Roman"/>
+                <w:b w:val="0"/>
+                <w:sz w:val="19"/>
+              </w:rPr>
+              <w:t>3</w:t>
+            </w:r>
+          </w:p>
+        </w:tc>
+        <w:tc>
+          <w:tcPr>
+            <w:tcW w:type="dxa" w:w="1800"/>
+            <w:shd w:fill="FEE2E2"/>
+            <w:tcMar>
+              <w:top w:w="80" w:type="dxa"/>
+              <w:bottom w:w="80" w:type="dxa"/>
+              <w:left w:w="80" w:type="dxa"/>
+              <w:right w:w="80" w:type="dxa"/>
+            </w:tcMar>
+          </w:tcPr>
+          <w:p>
+            <w:pPr>
+              <w:jc w:val="left"/>
+            </w:pPr>
+            <w:r>
+              <w:rPr>
+                <w:rFonts w:ascii="Times New Roman" w:hAnsi="Times New Roman"/>
+                <w:b/>
+                <w:sz w:val="19"/>
+              </w:rPr>
+              <w:t>Nurillayeva Dilsuz Mashrabovna</w:t>
+            </w:r>
+          </w:p>
+        </w:tc>
+        <w:tc>
+          <w:tcPr>
+            <w:tcW w:type="dxa" w:w="1800"/>
+            <w:shd w:fill="FEE2E2"/>
+            <w:tcMar>
+              <w:top w:w="80" w:type="dxa"/>
+              <w:bottom w:w="80" w:type="dxa"/>
+              <w:left w:w="80" w:type="dxa"/>
+              <w:right w:w="80" w:type="dxa"/>
+            </w:tcMar>
+          </w:tcPr>
+          <w:p>
+            <w:pPr>
+              <w:jc w:val="center"/>
+            </w:pPr>
+            <w:r>
+              <w:rPr>
+                <w:rFonts w:ascii="Times New Roman" w:hAnsi="Times New Roman"/>
+                <w:b w:val="0"/>
+                <w:sz w:val="19"/>
+              </w:rPr>
+              <w:t>AD4774693</w:t>
+            </w:r>
+          </w:p>
+        </w:tc>
+        <w:tc>
+          <w:tcPr>
+            <w:tcW w:type="dxa" w:w="1800"/>
+            <w:shd w:fill="FEE2E2"/>
+            <w:tcMar>
+              <w:top w:w="80" w:type="dxa"/>
+              <w:bottom w:w="80" w:type="dxa"/>
+              <w:left w:w="80" w:type="dxa"/>
+              <w:right w:w="80" w:type="dxa"/>
+            </w:tcMar>
+          </w:tcPr>
+          <w:p>
+            <w:pPr>
+              <w:jc w:val="center"/>
+            </w:pPr>
+            <w:r>
+              <w:rPr>
+                <w:rFonts w:ascii="Times New Roman" w:hAnsi="Times New Roman"/>
+                <w:b w:val="0"/>
+                <w:sz w:val="19"/>
+              </w:rPr>
+              <w:t>Mavjud emas</w:t>
+            </w:r>
+          </w:p>
+        </w:tc>
+        <w:tc>
+          <w:tcPr>
+            <w:tcW w:type="dxa" w:w="1800"/>
+            <w:shd w:fill="FEE2E2"/>
+            <w:tcMar>
+              <w:top w:w="80" w:type="dxa"/>
+              <w:bottom w:w="80" w:type="dxa"/>
+              <w:left w:w="80" w:type="dxa"/>
+              <w:right w:w="80" w:type="dxa"/>
+            </w:tcMar>
+          </w:tcPr>
+          <w:p>
+            <w:pPr>
+              <w:jc w:val="center"/>
+            </w:pPr>
+            <w:r>
+              <w:rPr>
+                <w:rFonts w:ascii="Times New Roman" w:hAnsi="Times New Roman"/>
+                <w:b/>
+                <w:color w:val="991B1B"/>
+                <w:sz w:val="19"/>
+              </w:rPr>
+              <w:t>🔴 Telefoni yo'q</w:t>
             </w:r>
           </w:p>
         </w:tc>
@@ -5955,6 +6302,353 @@
         </w:tc>
       </w:tr>
     </w:tbl>
+    <w:p>
+      <w:pPr>
+        <w:spacing w:before="280" w:after="120"/>
+      </w:pPr>
+      <w:r>
+        <w:rPr>
+          <w:rFonts w:ascii="Times New Roman" w:hAnsi="Times New Roman"/>
+          <w:b/>
+          <w:color w:val="312E81"/>
+          <w:sz w:val="24"/>
+        </w:rPr>
+        <w:t>📌 26-07 GURUHI — SO'ROVNOMA TOPSHIRMAGAN TALABALAR (1 NAFAR)</w:t>
+      </w:r>
+      <w:r>
+        <w:rPr>
+          <w:rFonts w:ascii="Times New Roman" w:hAnsi="Times New Roman"/>
+          <w:i/>
+          <w:sz w:val="22"/>
+        </w:rPr>
+        <w:t xml:space="preserve">  |  Guruh rahbari: Asraliyev.A</w:t>
+      </w:r>
+    </w:p>
+    <w:tbl>
+      <w:tblPr>
+        <w:tblW w:type="auto" w:w="0"/>
+        <w:jc w:val="center"/>
+        <w:tblLook w:firstColumn="1" w:firstRow="1" w:lastColumn="0" w:lastRow="0" w:noHBand="0" w:noVBand="1" w:val="04A0"/>
+      </w:tblPr>
+      <w:tblGrid>
+        <w:gridCol w:w="1800"/>
+        <w:gridCol w:w="1800"/>
+        <w:gridCol w:w="1800"/>
+        <w:gridCol w:w="1800"/>
+        <w:gridCol w:w="1800"/>
+        <w:gridCol w:w="1800"/>
+      </w:tblGrid>
+      <w:tr>
+        <w:tc>
+          <w:tcPr>
+            <w:tcW w:type="dxa" w:w="1800"/>
+            <w:shd w:fill="312E81"/>
+            <w:tcMar>
+              <w:top w:w="100" w:type="dxa"/>
+              <w:bottom w:w="100" w:type="dxa"/>
+              <w:left w:w="80" w:type="dxa"/>
+              <w:right w:w="80" w:type="dxa"/>
+            </w:tcMar>
+          </w:tcPr>
+          <w:p>
+            <w:pPr>
+              <w:jc w:val="center"/>
+            </w:pPr>
+            <w:r>
+              <w:rPr>
+                <w:rFonts w:ascii="Times New Roman" w:hAnsi="Times New Roman"/>
+                <w:b/>
+                <w:color w:val="FFFFFF"/>
+                <w:sz w:val="19"/>
+              </w:rPr>
+              <w:t>№</w:t>
+            </w:r>
+          </w:p>
+        </w:tc>
+        <w:tc>
+          <w:tcPr>
+            <w:tcW w:type="dxa" w:w="1800"/>
+            <w:shd w:fill="312E81"/>
+            <w:tcMar>
+              <w:top w:w="100" w:type="dxa"/>
+              <w:bottom w:w="100" w:type="dxa"/>
+              <w:left w:w="80" w:type="dxa"/>
+              <w:right w:w="80" w:type="dxa"/>
+            </w:tcMar>
+          </w:tcPr>
+          <w:p>
+            <w:pPr>
+              <w:jc w:val="center"/>
+            </w:pPr>
+            <w:r>
+              <w:rPr>
+                <w:rFonts w:ascii="Times New Roman" w:hAnsi="Times New Roman"/>
+                <w:b/>
+                <w:color w:val="FFFFFF"/>
+                <w:sz w:val="19"/>
+              </w:rPr>
+              <w:t>Talaba Familiyasi, Ismi, Otasining ismi</w:t>
+            </w:r>
+          </w:p>
+        </w:tc>
+        <w:tc>
+          <w:tcPr>
+            <w:tcW w:type="dxa" w:w="1800"/>
+            <w:shd w:fill="312E81"/>
+            <w:tcMar>
+              <w:top w:w="100" w:type="dxa"/>
+              <w:bottom w:w="100" w:type="dxa"/>
+              <w:left w:w="80" w:type="dxa"/>
+              <w:right w:w="80" w:type="dxa"/>
+            </w:tcMar>
+          </w:tcPr>
+          <w:p>
+            <w:pPr>
+              <w:jc w:val="center"/>
+            </w:pPr>
+            <w:r>
+              <w:rPr>
+                <w:rFonts w:ascii="Times New Roman" w:hAnsi="Times New Roman"/>
+                <w:b/>
+                <w:color w:val="FFFFFF"/>
+                <w:sz w:val="19"/>
+              </w:rPr>
+              <w:t>Pasport №</w:t>
+            </w:r>
+          </w:p>
+        </w:tc>
+        <w:tc>
+          <w:tcPr>
+            <w:tcW w:type="dxa" w:w="1800"/>
+            <w:shd w:fill="312E81"/>
+            <w:tcMar>
+              <w:top w:w="100" w:type="dxa"/>
+              <w:bottom w:w="100" w:type="dxa"/>
+              <w:left w:w="80" w:type="dxa"/>
+              <w:right w:w="80" w:type="dxa"/>
+            </w:tcMar>
+          </w:tcPr>
+          <w:p>
+            <w:pPr>
+              <w:jc w:val="center"/>
+            </w:pPr>
+            <w:r>
+              <w:rPr>
+                <w:rFonts w:ascii="Times New Roman" w:hAnsi="Times New Roman"/>
+                <w:b/>
+                <w:color w:val="FFFFFF"/>
+                <w:sz w:val="19"/>
+              </w:rPr>
+              <w:t>Telefon raqami</w:t>
+            </w:r>
+          </w:p>
+        </w:tc>
+        <w:tc>
+          <w:tcPr>
+            <w:tcW w:type="dxa" w:w="1800"/>
+            <w:shd w:fill="312E81"/>
+            <w:tcMar>
+              <w:top w:w="100" w:type="dxa"/>
+              <w:bottom w:w="100" w:type="dxa"/>
+              <w:left w:w="80" w:type="dxa"/>
+              <w:right w:w="80" w:type="dxa"/>
+            </w:tcMar>
+          </w:tcPr>
+          <w:p>
+            <w:pPr>
+              <w:jc w:val="center"/>
+            </w:pPr>
+            <w:r>
+              <w:rPr>
+                <w:rFonts w:ascii="Times New Roman" w:hAnsi="Times New Roman"/>
+                <w:b/>
+                <w:color w:val="FFFFFF"/>
+                <w:sz w:val="19"/>
+              </w:rPr>
+              <w:t>Holati</w:t>
+            </w:r>
+          </w:p>
+        </w:tc>
+        <w:tc>
+          <w:tcPr>
+            <w:tcW w:type="dxa" w:w="1800"/>
+            <w:shd w:fill="312E81"/>
+            <w:tcMar>
+              <w:top w:w="100" w:type="dxa"/>
+              <w:bottom w:w="100" w:type="dxa"/>
+              <w:left w:w="80" w:type="dxa"/>
+              <w:right w:w="80" w:type="dxa"/>
+            </w:tcMar>
+          </w:tcPr>
+          <w:p>
+            <w:pPr>
+              <w:jc w:val="center"/>
+            </w:pPr>
+            <w:r>
+              <w:rPr>
+                <w:rFonts w:ascii="Times New Roman" w:hAnsi="Times New Roman"/>
+                <w:b/>
+                <w:color w:val="FFFFFF"/>
+                <w:sz w:val="19"/>
+              </w:rPr>
+              <w:t>Guruh rahbari qaydi / Yangi manzil</w:t>
+            </w:r>
+          </w:p>
+        </w:tc>
+      </w:tr>
+      <w:tr>
+        <w:tc>
+          <w:tcPr>
+            <w:tcW w:type="dxa" w:w="1800"/>
+            <w:shd w:fill="FEE2E2"/>
+            <w:tcMar>
+              <w:top w:w="80" w:type="dxa"/>
+              <w:bottom w:w="80" w:type="dxa"/>
+              <w:left w:w="80" w:type="dxa"/>
+              <w:right w:w="80" w:type="dxa"/>
+            </w:tcMar>
+          </w:tcPr>
+          <w:p>
+            <w:pPr>
+              <w:jc w:val="center"/>
+            </w:pPr>
+            <w:r>
+              <w:rPr>
+                <w:rFonts w:ascii="Times New Roman" w:hAnsi="Times New Roman"/>
+                <w:b w:val="0"/>
+                <w:sz w:val="19"/>
+              </w:rPr>
+              <w:t>1</w:t>
+            </w:r>
+          </w:p>
+        </w:tc>
+        <w:tc>
+          <w:tcPr>
+            <w:tcW w:type="dxa" w:w="1800"/>
+            <w:shd w:fill="FEE2E2"/>
+            <w:tcMar>
+              <w:top w:w="80" w:type="dxa"/>
+              <w:bottom w:w="80" w:type="dxa"/>
+              <w:left w:w="80" w:type="dxa"/>
+              <w:right w:w="80" w:type="dxa"/>
+            </w:tcMar>
+          </w:tcPr>
+          <w:p>
+            <w:pPr>
+              <w:jc w:val="left"/>
+            </w:pPr>
+            <w:r>
+              <w:rPr>
+                <w:rFonts w:ascii="Times New Roman" w:hAnsi="Times New Roman"/>
+                <w:b/>
+                <w:sz w:val="19"/>
+              </w:rPr>
+              <w:t>Ergasheva Madina Tulqin qizi</w:t>
+            </w:r>
+          </w:p>
+        </w:tc>
+        <w:tc>
+          <w:tcPr>
+            <w:tcW w:type="dxa" w:w="1800"/>
+            <w:shd w:fill="FEE2E2"/>
+            <w:tcMar>
+              <w:top w:w="80" w:type="dxa"/>
+              <w:bottom w:w="80" w:type="dxa"/>
+              <w:left w:w="80" w:type="dxa"/>
+              <w:right w:w="80" w:type="dxa"/>
+            </w:tcMar>
+          </w:tcPr>
+          <w:p>
+            <w:pPr>
+              <w:jc w:val="center"/>
+            </w:pPr>
+            <w:r>
+              <w:rPr>
+                <w:rFonts w:ascii="Times New Roman" w:hAnsi="Times New Roman"/>
+                <w:b w:val="0"/>
+                <w:sz w:val="19"/>
+              </w:rPr>
+              <w:t>AC0429133</w:t>
+            </w:r>
+          </w:p>
+        </w:tc>
+        <w:tc>
+          <w:tcPr>
+            <w:tcW w:type="dxa" w:w="1800"/>
+            <w:shd w:fill="FEE2E2"/>
+            <w:tcMar>
+              <w:top w:w="80" w:type="dxa"/>
+              <w:bottom w:w="80" w:type="dxa"/>
+              <w:left w:w="80" w:type="dxa"/>
+              <w:right w:w="80" w:type="dxa"/>
+            </w:tcMar>
+          </w:tcPr>
+          <w:p>
+            <w:pPr>
+              <w:jc w:val="center"/>
+            </w:pPr>
+            <w:r>
+              <w:rPr>
+                <w:rFonts w:ascii="Times New Roman" w:hAnsi="Times New Roman"/>
+                <w:b w:val="0"/>
+                <w:sz w:val="19"/>
+              </w:rPr>
+              <w:t>Mavjud emas</w:t>
+            </w:r>
+          </w:p>
+        </w:tc>
+        <w:tc>
+          <w:tcPr>
+            <w:tcW w:type="dxa" w:w="1800"/>
+            <w:shd w:fill="FEE2E2"/>
+            <w:tcMar>
+              <w:top w:w="80" w:type="dxa"/>
+              <w:bottom w:w="80" w:type="dxa"/>
+              <w:left w:w="80" w:type="dxa"/>
+              <w:right w:w="80" w:type="dxa"/>
+            </w:tcMar>
+          </w:tcPr>
+          <w:p>
+            <w:pPr>
+              <w:jc w:val="center"/>
+            </w:pPr>
+            <w:r>
+              <w:rPr>
+                <w:rFonts w:ascii="Times New Roman" w:hAnsi="Times New Roman"/>
+                <w:b/>
+                <w:color w:val="991B1B"/>
+                <w:sz w:val="19"/>
+              </w:rPr>
+              <w:t>🔴 Telefoni yo'q</w:t>
+            </w:r>
+          </w:p>
+        </w:tc>
+        <w:tc>
+          <w:tcPr>
+            <w:tcW w:type="dxa" w:w="1800"/>
+            <w:shd w:fill="FFFFFF"/>
+            <w:tcMar>
+              <w:top w:w="80" w:type="dxa"/>
+              <w:bottom w:w="80" w:type="dxa"/>
+              <w:left w:w="80" w:type="dxa"/>
+              <w:right w:w="80" w:type="dxa"/>
+            </w:tcMar>
+          </w:tcPr>
+          <w:p>
+            <w:pPr>
+              <w:jc w:val="left"/>
+            </w:pPr>
+            <w:r>
+              <w:rPr>
+                <w:rFonts w:ascii="Times New Roman" w:hAnsi="Times New Roman"/>
+                <w:b w:val="0"/>
+                <w:sz w:val="19"/>
+              </w:rPr>
+            </w:r>
+          </w:p>
+        </w:tc>
+      </w:tr>
+    </w:tbl>
     <w:sectPr>
       <w:pgSz w:w="12240" w:h="15840"/>
       <w:pgMar w:top="720" w:right="720" w:bottom="720" w:left="720" w:header="720" w:footer="720" w:gutter="0"/>

</xml_diff>